<commit_message>
fix: make calendar person selection a filter
</commit_message>
<xml_diff>
--- a/docs/WorkForce-Manager-Documentazione.docx
+++ b/docs/WorkForce-Manager-Documentazione.docx
@@ -23,7 +23,7 @@
         <w:pStyle w:val="Date"/>
       </w:pPr>
       <w:r>
-        <w:t xml:space="preserve">2026-09-04</w:t>
+        <w:t xml:space="preserve">2026-09-07</w:t>
       </w:r>
     </w:p>
     <w:sdt>
@@ -1134,6 +1134,18 @@
       </w:pPr>
       <w:r>
         <w:t xml:space="preserve">Vista a griglia persona Ã— periodo (settimana/mese/anno), con due modalitÃ :</w:t>
+      </w:r>
+      <w:r>
+        <w:t xml:space="preserve"> </w:t>
+      </w:r>
+      <w:r>
+        <w:t xml:space="preserve">- un filtro persone ricercabile e multiselezione permette di mostrare solo</w:t>
+      </w:r>
+      <w:r>
+        <w:t xml:space="preserve"> </w:t>
+      </w:r>
+      <w:r>
+        <w:t xml:space="preserve">una o piÃ¹ risorse specifiche, senza modificare o selezionare le righe;</w:t>
       </w:r>
       <w:r>
         <w:t xml:space="preserve"> </w:t>
@@ -14077,13 +14089,13 @@
       </w:r>
     </w:p>
     <w:bookmarkEnd w:id="122"/>
-    <w:bookmarkStart w:id="123" w:name="X1082c985a89be2cba459b236dc355c89f65aeeb"/>
+    <w:bookmarkStart w:id="123" w:name="Xbacb170344d224136d1fd76e1609bcbe00f403f"/>
     <w:p>
       <w:pPr>
         <w:pStyle w:val="Heading3"/>
       </w:pPr>
       <w:r>
-        <w:t xml:space="preserve">WFM-004 â€” Ricerca e selezione multipla nel Calendario</w:t>
+        <w:t xml:space="preserve">WFM-004 â€” Filtro multiselezione persone nel Calendario</w:t>
       </w:r>
     </w:p>
     <w:p>
@@ -14141,13 +14153,19 @@
         <w:pStyle w:val="BodyText"/>
       </w:pPr>
       <w:r>
-        <w:t xml:space="preserve">Aggiungere un campo di ricerca per filtrare le persone visualizzate e una</w:t>
-      </w:r>
-      <w:r>
-        <w:t xml:space="preserve"> </w:t>
-      </w:r>
-      <w:r>
-        <w:t xml:space="preserve">selezione multipla per concentrarsi su una o piÃ¹ risorse specifiche.</w:t>
+        <w:t xml:space="preserve">Aggiungere un filtro ricercabile a selezione multipla per scegliere una o piÃ¹</w:t>
+      </w:r>
+      <w:r>
+        <w:t xml:space="preserve"> </w:t>
+      </w:r>
+      <w:r>
+        <w:t xml:space="preserve">risorse da visualizzare. La selezione appartiene al filtro sopra la tabella e</w:t>
+      </w:r>
+      <w:r>
+        <w:t xml:space="preserve"> </w:t>
+      </w:r>
+      <w:r>
+        <w:t xml:space="preserve">non alle singole righe del Calendario.</w:t>
       </w:r>
     </w:p>
     <w:p>
@@ -14183,13 +14201,13 @@
         </w:numPr>
       </w:pPr>
       <w:r>
-        <w:t xml:space="preserve">le checkbox consentono selezione singola, multipla e â€œseleziona tutte le</w:t>
-      </w:r>
-      <w:r>
-        <w:t xml:space="preserve"> </w:t>
-      </w:r>
-      <w:r>
-        <w:t xml:space="preserve">persone filtrateâ€;</w:t>
+        <w:t xml:space="preserve">il menu del filtro consente selezione singola, multipla, selezione dei</w:t>
+      </w:r>
+      <w:r>
+        <w:t xml:space="preserve"> </w:t>
+      </w:r>
+      <w:r>
+        <w:t xml:space="preserve">risultati ricercati e ripristino di tutte le persone;</w:t>
       </w:r>
     </w:p>
     <w:p>
@@ -14201,7 +14219,13 @@
         </w:numPr>
       </w:pPr>
       <w:r>
-        <w:t xml:space="preserve">il filtro resta applicato cambiando settimana, mese o anno;</w:t>
+        <w:t xml:space="preserve">la tabella non mostra checkbox sulle righe e contiene esclusivamente le</w:t>
+      </w:r>
+      <w:r>
+        <w:t xml:space="preserve"> </w:t>
+      </w:r>
+      <w:r>
+        <w:t xml:space="preserve">risorse scelte nel filtro;</w:t>
       </w:r>
     </w:p>
     <w:p>
@@ -14213,7 +14237,7 @@
         </w:numPr>
       </w:pPr>
       <w:r>
-        <w:t xml:space="preserve">cambiare modalitÃ  Staffing/Ferie-Assenze non perde la selezione;</w:t>
+        <w:t xml:space="preserve">il filtro resta applicato cambiando settimana, mese o anno;</w:t>
       </w:r>
     </w:p>
     <w:p>
@@ -14225,7 +14249,7 @@
         </w:numPr>
       </w:pPr>
       <w:r>
-        <w:t xml:space="preserve">se nessuna persona corrisponde viene mostrato uno stato vuoto esplicito;</w:t>
+        <w:t xml:space="preserve">cambiare modalitÃ  Staffing/Ferie-Assenze non perde la selezione;</w:t>
       </w:r>
     </w:p>
     <w:p>
@@ -14237,6 +14261,18 @@
         </w:numPr>
       </w:pPr>
       <w:r>
+        <w:t xml:space="preserve">se nessuna persona corrisponde viene mostrato uno stato vuoto esplicito;</w:t>
+      </w:r>
+    </w:p>
+    <w:p>
+      <w:pPr>
+        <w:pStyle w:val="Compact"/>
+        <w:numPr>
+          <w:ilvl w:val="0"/>
+          <w:numId w:val="1016"/>
+        </w:numPr>
+      </w:pPr>
+      <w:r>
         <w:t xml:space="preserve">il filtro Ã¨ solo di presentazione e non modifica i dati del calendario.</w:t>
       </w:r>
     </w:p>
@@ -15110,7 +15146,13 @@
         <w:t xml:space="preserve"> </w:t>
       </w:r>
       <w:r>
-        <w:t xml:space="preserve">ricerca e selezione multipla delle persone nel Calendario;</w:t>
+        <w:t xml:space="preserve">filtro ricercabile multiselezione delle persone nel Calendario,</w:t>
+      </w:r>
+      <w:r>
+        <w:t xml:space="preserve"> </w:t>
+      </w:r>
+      <w:r>
+        <w:t xml:space="preserve">senza checkbox sulle righe;</w:t>
       </w:r>
     </w:p>
     <w:p>

</xml_diff>

<commit_message>
feat(staffing): contractor productivity toggle, person type in calendar, and commessaId in project selectors
</commit_message>
<xml_diff>
--- a/docs/WorkForce-Manager-Documentazione.docx
+++ b/docs/WorkForce-Manager-Documentazione.docx
@@ -23,7 +23,7 @@
         <w:pStyle w:val="Date"/>
       </w:pPr>
       <w:r>
-        <w:t xml:space="preserve">2026-09-07</w:t>
+        <w:t xml:space="preserve">2026-09-11</w:t>
       </w:r>
     </w:p>
     <w:sdt>
@@ -590,7 +590,19 @@
         <w:t xml:space="preserve"> </w:t>
       </w:r>
       <w:r>
-        <w:t xml:space="preserve">allocazione, allocazione media del team, capacitÃ  libera in ore/FTE,</w:t>
+        <w:t xml:space="preserve">allocazione, allocazione media del team (con opzione di configurazione e</w:t>
+      </w:r>
+      <w:r>
+        <w:t xml:space="preserve"> </w:t>
+      </w:r>
+      <w:r>
+        <w:t xml:space="preserve">filtro rapido per includere o escludere i consulenti/contractor dal calcolo</w:t>
+      </w:r>
+      <w:r>
+        <w:t xml:space="preserve"> </w:t>
+      </w:r>
+      <w:r>
+        <w:t xml:space="preserve">della produttivitÃ  e allocazione mensile di team), capacitÃ  libera in ore/FTE,</w:t>
       </w:r>
       <w:r>
         <w:t xml:space="preserve"> </w:t>
@@ -1139,13 +1151,83 @@
         <w:t xml:space="preserve"> </w:t>
       </w:r>
       <w:r>
-        <w:t xml:space="preserve">- un filtro persone ricercabile e multiselezione permette di mostrare solo</w:t>
-      </w:r>
-      <w:r>
-        <w:t xml:space="preserve"> </w:t>
-      </w:r>
-      <w:r>
-        <w:t xml:space="preserve">una o piÃ¹ risorse specifiche, senza modificare o selezionare le righe;</w:t>
+        <w:t xml:space="preserve">- ciascuna persona mostra il badge/etichetta con il</w:t>
+      </w:r>
+      <w:r>
+        <w:t xml:space="preserve"> </w:t>
+      </w:r>
+      <w:r>
+        <w:rPr>
+          <w:b/>
+          <w:bCs/>
+        </w:rPr>
+        <w:t xml:space="preserve">tipo risorsa</w:t>
+      </w:r>
+      <w:r>
+        <w:t xml:space="preserve"> </w:t>
+      </w:r>
+      <w:r>
+        <w:t xml:space="preserve">(</w:t>
+      </w:r>
+      <w:r>
+        <w:rPr>
+          <w:rStyle w:val="VerbatimChar"/>
+        </w:rPr>
+        <w:t xml:space="preserve">Dipendente</w:t>
+      </w:r>
+      <w:r>
+        <w:t xml:space="preserve">,</w:t>
+      </w:r>
+      <w:r>
+        <w:t xml:space="preserve"> </w:t>
+      </w:r>
+      <w:r>
+        <w:rPr>
+          <w:rStyle w:val="VerbatimChar"/>
+        </w:rPr>
+        <w:t xml:space="preserve">Consulente</w:t>
+      </w:r>
+      <w:r>
+        <w:t xml:space="preserve">,</w:t>
+      </w:r>
+      <w:r>
+        <w:t xml:space="preserve"> </w:t>
+      </w:r>
+      <w:r>
+        <w:rPr>
+          <w:rStyle w:val="VerbatimChar"/>
+        </w:rPr>
+        <w:t xml:space="preserve">Stage</w:t>
+      </w:r>
+      <w:r>
+        <w:t xml:space="preserve">) e tooltip descrittivo (</w:t>
+      </w:r>
+      <w:r>
+        <w:rPr>
+          <w:rStyle w:val="VerbatimChar"/>
+        </w:rPr>
+        <w:t xml:space="preserve">Nome (Tipo) - Ruolo</w:t>
+      </w:r>
+      <w:r>
+        <w:t xml:space="preserve">);</w:t>
+      </w:r>
+      <w:r>
+        <w:t xml:space="preserve"> </w:t>
+      </w:r>
+      <w:r>
+        <w:t xml:space="preserve">- un filtro persone ricercabile e multiselezione permette di cercare e</w:t>
+      </w:r>
+      <w:r>
+        <w:t xml:space="preserve"> </w:t>
+      </w:r>
+      <w:r>
+        <w:t xml:space="preserve">mostrare solo una o piÃ¹ risorse specifiche (filtrabili per nome, ruolo o tipo</w:t>
+      </w:r>
+      <w:r>
+        <w:t xml:space="preserve"> </w:t>
+      </w:r>
+      <w:r>
+        <w:t xml:space="preserve">risorsa), senza modificare o selezionare le righe;</w:t>
       </w:r>
       <w:r>
         <w:t xml:space="preserve"> </w:t>
@@ -1218,6 +1300,33 @@
         <w:t xml:space="preserve"> </w:t>
       </w:r>
       <w:r>
+        <w:t xml:space="preserve">Nelle righe espanse di assegnazione e nel modale di censimento rapido, la</w:t>
+      </w:r>
+      <w:r>
+        <w:t xml:space="preserve"> </w:t>
+      </w:r>
+      <w:r>
+        <w:t xml:space="preserve">selezione del progetto riporta esplicitamente sia il nome del progetto sia</w:t>
+      </w:r>
+      <w:r>
+        <w:t xml:space="preserve"> </w:t>
+      </w:r>
+      <w:r>
+        <w:t xml:space="preserve">il codice commessa associato (</w:t>
+      </w:r>
+      <w:r>
+        <w:rPr>
+          <w:rStyle w:val="VerbatimChar"/>
+        </w:rPr>
+        <w:t xml:space="preserve">commessaId</w:t>
+      </w:r>
+      <w:r>
+        <w:t xml:space="preserve">), presente anche nel tooltip di dettaglio;</w:t>
+      </w:r>
+      <w:r>
+        <w:t xml:space="preserve"> </w:t>
+      </w:r>
+      <w:r>
         <w:t xml:space="preserve">-</w:t>
       </w:r>
       <w:r>
@@ -1357,16 +1466,22 @@
           <w:b/>
           <w:bCs/>
         </w:rPr>
-        <w:t xml:space="preserve">Soglie</w:t>
-      </w:r>
-      <w:r>
-        <w:t xml:space="preserve">: percentuali di sotto/sovra-allocazione usate per colorare</w:t>
-      </w:r>
-      <w:r>
-        <w:t xml:space="preserve"> </w:t>
-      </w:r>
-      <w:r>
-        <w:t xml:space="preserve">Dashboard, Persone e Calendario.</w:t>
+        <w:t xml:space="preserve">Soglie e produttivitÃ </w:t>
+      </w:r>
+      <w:r>
+        <w:t xml:space="preserve">: percentuali di sotto/sovra-allocazione usate per</w:t>
+      </w:r>
+      <w:r>
+        <w:t xml:space="preserve"> </w:t>
+      </w:r>
+      <w:r>
+        <w:t xml:space="preserve">colorare Dashboard, Persone e Calendario, oltre all’opzione di default per</w:t>
+      </w:r>
+      <w:r>
+        <w:t xml:space="preserve"> </w:t>
+      </w:r>
+      <w:r>
+        <w:t xml:space="preserve">includere o escludere i contractor/consulenti dai KPI di produttivitÃ .</w:t>
       </w:r>
     </w:p>
     <w:p>
@@ -12919,7 +13034,7 @@
     </w:p>
     <w:bookmarkEnd w:id="117"/>
     <w:bookmarkEnd w:id="118"/>
-    <w:bookmarkStart w:id="131" w:name="backlog-prodotto-â-workforce-manager"/>
+    <w:bookmarkStart w:id="134" w:name="backlog-prodotto-â-workforce-manager"/>
     <w:p>
       <w:pPr>
         <w:pStyle w:val="Heading1"/>
@@ -13487,9 +13602,180 @@
           </w:p>
         </w:tc>
       </w:tr>
+      <w:tr>
+        <w:tc>
+          <w:tcPr/>
+          <w:p>
+            <w:pPr>
+              <w:pStyle w:val="Compact"/>
+            </w:pPr>
+            <w:r>
+              <w:t xml:space="preserve">WFM-008</w:t>
+            </w:r>
+          </w:p>
+        </w:tc>
+        <w:tc>
+          <w:tcPr/>
+          <w:p>
+            <w:pPr>
+              <w:pStyle w:val="Compact"/>
+            </w:pPr>
+            <w:r>
+              <w:t xml:space="preserve">Dashboard / Impostazioni</w:t>
+            </w:r>
+          </w:p>
+        </w:tc>
+        <w:tc>
+          <w:tcPr/>
+          <w:p>
+            <w:pPr>
+              <w:pStyle w:val="Compact"/>
+            </w:pPr>
+            <w:r>
+              <w:t xml:space="preserve">Inclusione configurabile dei contractor nella produttivitÃ  mensile</w:t>
+            </w:r>
+          </w:p>
+        </w:tc>
+        <w:tc>
+          <w:tcPr/>
+          <w:p>
+            <w:pPr>
+              <w:pStyle w:val="Compact"/>
+            </w:pPr>
+            <w:r>
+              <w:t xml:space="preserve">P1</w:t>
+            </w:r>
+          </w:p>
+        </w:tc>
+        <w:tc>
+          <w:tcPr/>
+          <w:p>
+            <w:pPr>
+              <w:pStyle w:val="Compact"/>
+            </w:pPr>
+            <w:r>
+              <w:t xml:space="preserve">Impostazioni / Calcolo KPI</w:t>
+            </w:r>
+          </w:p>
+        </w:tc>
+      </w:tr>
+      <w:tr>
+        <w:tc>
+          <w:tcPr/>
+          <w:p>
+            <w:pPr>
+              <w:pStyle w:val="Compact"/>
+            </w:pPr>
+            <w:r>
+              <w:t xml:space="preserve">WFM-009</w:t>
+            </w:r>
+          </w:p>
+        </w:tc>
+        <w:tc>
+          <w:tcPr/>
+          <w:p>
+            <w:pPr>
+              <w:pStyle w:val="Compact"/>
+            </w:pPr>
+            <w:r>
+              <w:t xml:space="preserve">Calendario</w:t>
+            </w:r>
+          </w:p>
+        </w:tc>
+        <w:tc>
+          <w:tcPr/>
+          <w:p>
+            <w:pPr>
+              <w:pStyle w:val="Compact"/>
+            </w:pPr>
+            <w:r>
+              <w:t xml:space="preserve">Visualizzazione tipo persona nel Calendario</w:t>
+            </w:r>
+          </w:p>
+        </w:tc>
+        <w:tc>
+          <w:tcPr/>
+          <w:p>
+            <w:pPr>
+              <w:pStyle w:val="Compact"/>
+            </w:pPr>
+            <w:r>
+              <w:t xml:space="preserve">P1</w:t>
+            </w:r>
+          </w:p>
+        </w:tc>
+        <w:tc>
+          <w:tcPr/>
+          <w:p>
+            <w:pPr>
+              <w:pStyle w:val="Compact"/>
+            </w:pPr>
+            <w:r>
+              <w:t xml:space="preserve">Snapshot staffing, UI Calendario</w:t>
+            </w:r>
+          </w:p>
+        </w:tc>
+      </w:tr>
+      <w:tr>
+        <w:tc>
+          <w:tcPr/>
+          <w:p>
+            <w:pPr>
+              <w:pStyle w:val="Compact"/>
+            </w:pPr>
+            <w:r>
+              <w:t xml:space="preserve">WFM-010</w:t>
+            </w:r>
+          </w:p>
+        </w:tc>
+        <w:tc>
+          <w:tcPr/>
+          <w:p>
+            <w:pPr>
+              <w:pStyle w:val="Compact"/>
+            </w:pPr>
+            <w:r>
+              <w:t xml:space="preserve">Calendario / Assegnazioni</w:t>
+            </w:r>
+          </w:p>
+        </w:tc>
+        <w:tc>
+          <w:tcPr/>
+          <w:p>
+            <w:pPr>
+              <w:pStyle w:val="Compact"/>
+            </w:pPr>
+            <w:r>
+              <w:t xml:space="preserve">Visualizzazione codice commessa nella selezione assegnazione</w:t>
+            </w:r>
+          </w:p>
+        </w:tc>
+        <w:tc>
+          <w:tcPr/>
+          <w:p>
+            <w:pPr>
+              <w:pStyle w:val="Compact"/>
+            </w:pPr>
+            <w:r>
+              <w:t xml:space="preserve">P1</w:t>
+            </w:r>
+          </w:p>
+        </w:tc>
+        <w:tc>
+          <w:tcPr/>
+          <w:p>
+            <w:pPr>
+              <w:pStyle w:val="Compact"/>
+            </w:pPr>
+            <w:r>
+              <w:t xml:space="preserve">Progetti, commessaId, UI Calendario / Modal</w:t>
+            </w:r>
+          </w:p>
+        </w:tc>
+      </w:tr>
     </w:tbl>
     <w:bookmarkEnd w:id="119"/>
-    <w:bookmarkStart w:id="127" w:name="item-dettagliati"/>
+    <w:bookmarkStart w:id="130" w:name="item-dettagliati"/>
     <w:p>
       <w:pPr>
         <w:pStyle w:val="Heading2"/>
@@ -14921,14 +15207,113 @@
       </w:r>
     </w:p>
     <w:bookmarkEnd w:id="126"/>
-    <w:bookmarkEnd w:id="127"/>
-    <w:bookmarkStart w:id="128" w:name="ordine-suggerito-di-rilascio"/>
-    <w:p>
-      <w:pPr>
-        <w:pStyle w:val="Heading2"/>
-      </w:pPr>
-      <w:r>
-        <w:t xml:space="preserve">Ordine suggerito di rilascio</w:t>
+    <w:bookmarkStart w:id="127" w:name="X6edbeeb3f562fdd90ae375ccba8fc82ef6cd3a6"/>
+    <w:p>
+      <w:pPr>
+        <w:pStyle w:val="Heading3"/>
+      </w:pPr>
+      <w:r>
+        <w:t xml:space="preserve">WFM-008 â€” Inclusione configurabile dei contractor nella produttivitÃ  mensile</w:t>
+      </w:r>
+    </w:p>
+    <w:p>
+      <w:pPr>
+        <w:pStyle w:val="FirstParagraph"/>
+      </w:pPr>
+      <w:r>
+        <w:rPr>
+          <w:b/>
+          <w:bCs/>
+        </w:rPr>
+        <w:t xml:space="preserve">Area:</w:t>
+      </w:r>
+      <w:r>
+        <w:t xml:space="preserve"> </w:t>
+      </w:r>
+      <w:r>
+        <w:t xml:space="preserve">Dashboard / Impostazioni Â·</w:t>
+      </w:r>
+      <w:r>
+        <w:t xml:space="preserve"> </w:t>
+      </w:r>
+      <w:r>
+        <w:rPr>
+          <w:b/>
+          <w:bCs/>
+        </w:rPr>
+        <w:t xml:space="preserve">PrioritÃ :</w:t>
+      </w:r>
+      <w:r>
+        <w:t xml:space="preserve"> </w:t>
+      </w:r>
+      <w:r>
+        <w:t xml:space="preserve">P1 Â·</w:t>
+      </w:r>
+      <w:r>
+        <w:t xml:space="preserve"> </w:t>
+      </w:r>
+      <w:r>
+        <w:rPr>
+          <w:b/>
+          <w:bCs/>
+        </w:rPr>
+        <w:t xml:space="preserve">Tipo:</w:t>
+      </w:r>
+      <w:r>
+        <w:t xml:space="preserve"> </w:t>
+      </w:r>
+      <w:r>
+        <w:t xml:space="preserve">reporting / configurazione</w:t>
+      </w:r>
+    </w:p>
+    <w:p>
+      <w:pPr>
+        <w:pStyle w:val="BodyText"/>
+      </w:pPr>
+      <w:r>
+        <w:t xml:space="preserve">Consentire all’utente/amministratore di scegliere se le risorse esterne</w:t>
+      </w:r>
+      <w:r>
+        <w:t xml:space="preserve"> </w:t>
+      </w:r>
+      <w:r>
+        <w:t xml:space="preserve">(</w:t>
+      </w:r>
+      <w:r>
+        <w:rPr>
+          <w:rStyle w:val="VerbatimChar"/>
+        </w:rPr>
+        <w:t xml:space="preserve">type = 'consulente'</w:t>
+      </w:r>
+      <w:r>
+        <w:t xml:space="preserve"> </w:t>
+      </w:r>
+      <w:r>
+        <w:t xml:space="preserve">/ contractor) devono concorrere al calcolo della</w:t>
+      </w:r>
+      <w:r>
+        <w:t xml:space="preserve"> </w:t>
+      </w:r>
+      <w:r>
+        <w:t xml:space="preserve">produttivitÃ  e della media di allocazione mensile nella Dashboard (e relativi</w:t>
+      </w:r>
+      <w:r>
+        <w:t xml:space="preserve"> </w:t>
+      </w:r>
+      <w:r>
+        <w:t xml:space="preserve">KPI del team: media allocazione, FTE allocati, risorse sotto/sovra-utilizzate).</w:t>
+      </w:r>
+    </w:p>
+    <w:p>
+      <w:pPr>
+        <w:pStyle w:val="BodyText"/>
+      </w:pPr>
+      <w:r>
+        <w:rPr>
+          <w:b/>
+          <w:bCs/>
+        </w:rPr>
+        <w:t xml:space="preserve">Criteri di accettazione</w:t>
       </w:r>
     </w:p>
     <w:p>
@@ -14940,23 +15325,7 @@
         </w:numPr>
       </w:pPr>
       <w:r>
-        <w:rPr>
-          <w:b/>
-          <w:bCs/>
-        </w:rPr>
-        <w:t xml:space="preserve">P0 â€” IntegritÃ  del calendario:</w:t>
-      </w:r>
-      <w:r>
-        <w:t xml:space="preserve"> </w:t>
-      </w:r>
-      <w:r>
-        <w:t xml:space="preserve">WFM-001 e WFM-006, includendo i</w:t>
-      </w:r>
-      <w:r>
-        <w:t xml:space="preserve"> </w:t>
-      </w:r>
-      <w:r>
-        <w:t xml:space="preserve">controlli server-side e i test sulle sovrapposizioni.</w:t>
+        <w:t xml:space="preserve">presenza di un’opzione di configurazione (in Impostazioni &gt; Soglie o toggle rapido in Dashboard) per includere/escludere i contractor dal calcolo della produttivitÃ /allocazione;</w:t>
       </w:r>
     </w:p>
     <w:p>
@@ -14968,17 +15337,7 @@
         </w:numPr>
       </w:pPr>
       <w:r>
-        <w:rPr>
-          <w:b/>
-          <w:bCs/>
-        </w:rPr>
-        <w:t xml:space="preserve">P1 â€” OperativitÃ  quotidiana:</w:t>
-      </w:r>
-      <w:r>
-        <w:t xml:space="preserve"> </w:t>
-      </w:r>
-      <w:r>
-        <w:t xml:space="preserve">WFM-003, WFM-004 e WFM-007.</w:t>
+        <w:t xml:space="preserve">quando l’opzione esclude i contractor, la media del team, le ore libere, gli FTE e gli elenchi sotto/sovra-allocazione considerano solo i dipendenti/stage;</w:t>
       </w:r>
     </w:p>
     <w:p>
@@ -14990,23 +15349,7 @@
         </w:numPr>
       </w:pPr>
       <w:r>
-        <w:rPr>
-          <w:b/>
-          <w:bCs/>
-        </w:rPr>
-        <w:t xml:space="preserve">P1 â€” Reporting:</w:t>
-      </w:r>
-      <w:r>
-        <w:t xml:space="preserve"> </w:t>
-      </w:r>
-      <w:r>
-        <w:t xml:space="preserve">WFM-005, dopo la decisione sulla definizione di</w:t>
-      </w:r>
-      <w:r>
-        <w:t xml:space="preserve"> </w:t>
-      </w:r>
-      <w:r>
-        <w:t xml:space="preserve">â€œproduttivitÃ â€.</w:t>
+        <w:t xml:space="preserve">la vista di riepilogo dei progetti continua a mostrare l’allocazione effettiva complessiva sul progetto o evidenzia la quota contractor/dipendenti;</w:t>
       </w:r>
     </w:p>
     <w:p>
@@ -15018,41 +15361,186 @@
         </w:numPr>
       </w:pPr>
       <w:r>
+        <w:t xml:space="preserve">lo stato dell’impostazione viene persistito ed Ã¨ coerente al cambio mese/settimana/anno;</w:t>
+      </w:r>
+    </w:p>
+    <w:p>
+      <w:pPr>
+        <w:pStyle w:val="Compact"/>
+        <w:numPr>
+          <w:ilvl w:val="0"/>
+          <w:numId w:val="1020"/>
+        </w:numPr>
+      </w:pPr>
+      <w:r>
+        <w:t xml:space="preserve">calcoli e formule sono coperti da test unitari.</w:t>
+      </w:r>
+    </w:p>
+    <w:bookmarkEnd w:id="127"/>
+    <w:bookmarkStart w:id="128" w:name="X9cd5384eba9991ee0adf6f8b4bdb9f6392c47de"/>
+    <w:p>
+      <w:pPr>
+        <w:pStyle w:val="Heading3"/>
+      </w:pPr>
+      <w:r>
+        <w:t xml:space="preserve">WFM-009 â€” Visualizzazione tipo persona nel Calendario</w:t>
+      </w:r>
+    </w:p>
+    <w:p>
+      <w:pPr>
+        <w:pStyle w:val="FirstParagraph"/>
+      </w:pPr>
+      <w:r>
         <w:rPr>
           <w:b/>
           <w:bCs/>
         </w:rPr>
-        <w:t xml:space="preserve">P1 â€” Supporto decisionale:</w:t>
-      </w:r>
-      <w:r>
-        <w:t xml:space="preserve"> </w:t>
-      </w:r>
-      <w:r>
-        <w:t xml:space="preserve">WFM-002, dopo la conferma della formula</w:t>
-      </w:r>
-      <w:r>
-        <w:t xml:space="preserve"> </w:t>
-      </w:r>
-      <w:r>
-        <w:t xml:space="preserve">ore/settimana â†’ ore/giorno.</w:t>
-      </w:r>
-    </w:p>
-    <w:bookmarkEnd w:id="128"/>
-    <w:bookmarkStart w:id="129" w:name="stato-implementazione-â-2026-09-04"/>
-    <w:p>
-      <w:pPr>
-        <w:pStyle w:val="Heading2"/>
-      </w:pPr>
-      <w:r>
-        <w:t xml:space="preserve">Stato implementazione â€” 2026-09-04</w:t>
-      </w:r>
-    </w:p>
-    <w:p>
-      <w:pPr>
-        <w:pStyle w:val="FirstParagraph"/>
-      </w:pPr>
-      <w:r>
-        <w:t xml:space="preserve">Gli item richiesti sono stati implementati nel codice corrente:</w:t>
+        <w:t xml:space="preserve">Area:</w:t>
+      </w:r>
+      <w:r>
+        <w:t xml:space="preserve"> </w:t>
+      </w:r>
+      <w:r>
+        <w:t xml:space="preserve">Calendario Â·</w:t>
+      </w:r>
+      <w:r>
+        <w:t xml:space="preserve"> </w:t>
+      </w:r>
+      <w:r>
+        <w:rPr>
+          <w:b/>
+          <w:bCs/>
+        </w:rPr>
+        <w:t xml:space="preserve">PrioritÃ :</w:t>
+      </w:r>
+      <w:r>
+        <w:t xml:space="preserve"> </w:t>
+      </w:r>
+      <w:r>
+        <w:t xml:space="preserve">P1 Â·</w:t>
+      </w:r>
+      <w:r>
+        <w:t xml:space="preserve"> </w:t>
+      </w:r>
+      <w:r>
+        <w:rPr>
+          <w:b/>
+          <w:bCs/>
+        </w:rPr>
+        <w:t xml:space="preserve">Tipo:</w:t>
+      </w:r>
+      <w:r>
+        <w:t xml:space="preserve"> </w:t>
+      </w:r>
+      <w:r>
+        <w:t xml:space="preserve">UX</w:t>
+      </w:r>
+    </w:p>
+    <w:p>
+      <w:pPr>
+        <w:pStyle w:val="BodyText"/>
+      </w:pPr>
+      <w:r>
+        <w:t xml:space="preserve">Nel Calendario, mostrare esplicitamente per ogni risorsa il campo</w:t>
+      </w:r>
+      <w:r>
+        <w:t xml:space="preserve"> </w:t>
+      </w:r>
+      <w:r>
+        <w:rPr>
+          <w:b/>
+          <w:bCs/>
+        </w:rPr>
+        <w:t xml:space="preserve">Tipo</w:t>
+      </w:r>
+      <w:r>
+        <w:t xml:space="preserve"> </w:t>
+      </w:r>
+      <w:r>
+        <w:t xml:space="preserve">definito nell’anagrafica Persone (</w:t>
+      </w:r>
+      <w:r>
+        <w:rPr>
+          <w:rStyle w:val="VerbatimChar"/>
+        </w:rPr>
+        <w:t xml:space="preserve">Dipendente</w:t>
+      </w:r>
+      <w:r>
+        <w:t xml:space="preserve">,</w:t>
+      </w:r>
+      <w:r>
+        <w:t xml:space="preserve"> </w:t>
+      </w:r>
+      <w:r>
+        <w:rPr>
+          <w:rStyle w:val="VerbatimChar"/>
+        </w:rPr>
+        <w:t xml:space="preserve">Consulente</w:t>
+      </w:r>
+      <w:r>
+        <w:t xml:space="preserve">,</w:t>
+      </w:r>
+      <w:r>
+        <w:t xml:space="preserve"> </w:t>
+      </w:r>
+      <w:r>
+        <w:rPr>
+          <w:rStyle w:val="VerbatimChar"/>
+        </w:rPr>
+        <w:t xml:space="preserve">Stage</w:t>
+      </w:r>
+      <w:r>
+        <w:t xml:space="preserve">),</w:t>
+      </w:r>
+      <w:r>
+        <w:t xml:space="preserve"> </w:t>
+      </w:r>
+      <w:r>
+        <w:t xml:space="preserve">tramite etichetta/badge dedicato o testo affiancato al nome, integrato da</w:t>
+      </w:r>
+      <w:r>
+        <w:t xml:space="preserve"> </w:t>
+      </w:r>
+      <w:r>
+        <w:t xml:space="preserve">un tooltip esplicativo (es:</w:t>
+      </w:r>
+      <w:r>
+        <w:t xml:space="preserve"> </w:t>
+      </w:r>
+      <w:r>
+        <w:rPr>
+          <w:i/>
+          <w:iCs/>
+        </w:rPr>
+        <w:t xml:space="preserve">Eustachio Sardone (Dipendente)</w:t>
+      </w:r>
+      <w:r>
+        <w:t xml:space="preserve">,</w:t>
+      </w:r>
+      <w:r>
+        <w:t xml:space="preserve"> </w:t>
+      </w:r>
+      <w:r>
+        <w:rPr>
+          <w:i/>
+          <w:iCs/>
+        </w:rPr>
+        <w:t xml:space="preserve">Claudio Anelli (Consulente)</w:t>
+      </w:r>
+      <w:r>
+        <w:t xml:space="preserve">).</w:t>
+      </w:r>
+    </w:p>
+    <w:p>
+      <w:pPr>
+        <w:pStyle w:val="BodyText"/>
+      </w:pPr>
+      <w:r>
+        <w:rPr>
+          <w:b/>
+          <w:bCs/>
+        </w:rPr>
+        <w:t xml:space="preserve">Criteri di accettazione</w:t>
       </w:r>
     </w:p>
     <w:p>
@@ -15064,17 +15552,49 @@
         </w:numPr>
       </w:pPr>
       <w:r>
-        <w:rPr>
-          <w:b/>
-          <w:bCs/>
-        </w:rPr>
-        <w:t xml:space="preserve">WFM-001:</w:t>
-      </w:r>
-      <w:r>
-        <w:t xml:space="preserve"> </w:t>
-      </w:r>
-      <w:r>
-        <w:t xml:space="preserve">blocco server-side e disabilitazione UI sulle festivitÃ ;</w:t>
+        <w:t xml:space="preserve">il tipo persona (</w:t>
+      </w:r>
+      <w:r>
+        <w:rPr>
+          <w:rStyle w:val="VerbatimChar"/>
+        </w:rPr>
+        <w:t xml:space="preserve">dipendente</w:t>
+      </w:r>
+      <w:r>
+        <w:t xml:space="preserve">,</w:t>
+      </w:r>
+      <w:r>
+        <w:t xml:space="preserve"> </w:t>
+      </w:r>
+      <w:r>
+        <w:rPr>
+          <w:rStyle w:val="VerbatimChar"/>
+        </w:rPr>
+        <w:t xml:space="preserve">consulente</w:t>
+      </w:r>
+      <w:r>
+        <w:t xml:space="preserve">,</w:t>
+      </w:r>
+      <w:r>
+        <w:t xml:space="preserve"> </w:t>
+      </w:r>
+      <w:r>
+        <w:rPr>
+          <w:rStyle w:val="VerbatimChar"/>
+        </w:rPr>
+        <w:t xml:space="preserve">stage</w:t>
+      </w:r>
+      <w:r>
+        <w:t xml:space="preserve">) Ã¨ incluso nel payload dello snapshot staffing (</w:t>
+      </w:r>
+      <w:r>
+        <w:rPr>
+          <w:rStyle w:val="VerbatimChar"/>
+        </w:rPr>
+        <w:t xml:space="preserve">/staffing/snapshot</w:t>
+      </w:r>
+      <w:r>
+        <w:t xml:space="preserve">) e fruibile nel Calendario;</w:t>
       </w:r>
     </w:p>
     <w:p>
@@ -15086,23 +15606,19 @@
         </w:numPr>
       </w:pPr>
       <w:r>
-        <w:rPr>
-          <w:b/>
-          <w:bCs/>
-        </w:rPr>
-        <w:t xml:space="preserve">WFM-002:</w:t>
-      </w:r>
-      <w:r>
-        <w:t xml:space="preserve"> </w:t>
-      </w:r>
-      <w:r>
-        <w:t xml:space="preserve">tooltip percentuale/ore nel Calendario, con capacitÃ  su 5 giorni</w:t>
-      </w:r>
-      <w:r>
-        <w:t xml:space="preserve"> </w:t>
-      </w:r>
-      <w:r>
-        <w:t xml:space="preserve">lavorativi;</w:t>
+        <w:t xml:space="preserve">nella colonna</w:t>
+      </w:r>
+      <w:r>
+        <w:t xml:space="preserve"> </w:t>
+      </w:r>
+      <w:r>
+        <w:t xml:space="preserve">“Persona”</w:t>
+      </w:r>
+      <w:r>
+        <w:t xml:space="preserve"> </w:t>
+      </w:r>
+      <w:r>
+        <w:t xml:space="preserve">Ã¨ visibile la tipologia risorsa accanto al nome (es. badge/etichetta o testo formattato);</w:t>
       </w:r>
     </w:p>
     <w:p>
@@ -15114,17 +15630,22 @@
         </w:numPr>
       </w:pPr>
       <w:r>
-        <w:rPr>
-          <w:b/>
-          <w:bCs/>
-        </w:rPr>
-        <w:t xml:space="preserve">WFM-003:</w:t>
-      </w:r>
-      <w:r>
-        <w:t xml:space="preserve"> </w:t>
-      </w:r>
-      <w:r>
-        <w:t xml:space="preserve">selezione e cancellazione multipla delle Persone;</w:t>
+        <w:t xml:space="preserve">al passaggio del mouse sul nome della persona Ã¨ disponibile un tooltip esplicito con formato</w:t>
+      </w:r>
+      <w:r>
+        <w:t xml:space="preserve"> </w:t>
+      </w:r>
+      <w:r>
+        <w:rPr>
+          <w:rStyle w:val="VerbatimChar"/>
+        </w:rPr>
+        <w:t xml:space="preserve">Nome Cognome (Tipo)</w:t>
+      </w:r>
+      <w:r>
+        <w:t xml:space="preserve"> </w:t>
+      </w:r>
+      <w:r>
+        <w:t xml:space="preserve">e ruolo;</w:t>
       </w:r>
     </w:p>
     <w:p>
@@ -15136,23 +15657,7 @@
         </w:numPr>
       </w:pPr>
       <w:r>
-        <w:rPr>
-          <w:b/>
-          <w:bCs/>
-        </w:rPr>
-        <w:t xml:space="preserve">WFM-004:</w:t>
-      </w:r>
-      <w:r>
-        <w:t xml:space="preserve"> </w:t>
-      </w:r>
-      <w:r>
-        <w:t xml:space="preserve">filtro ricercabile multiselezione delle persone nel Calendario,</w:t>
-      </w:r>
-      <w:r>
-        <w:t xml:space="preserve"> </w:t>
-      </w:r>
-      <w:r>
-        <w:t xml:space="preserve">senza checkbox sulle righe;</w:t>
+        <w:t xml:space="preserve">la visualizzazione Ã¨ attiva sia in modalitÃ  Staffing sia in Ferie/Assenze;</w:t>
       </w:r>
     </w:p>
     <w:p>
@@ -15164,17 +15669,159 @@
         </w:numPr>
       </w:pPr>
       <w:r>
+        <w:t xml:space="preserve">il filtro di ricerca persone nel Calendario permette la ricerca anche per tipo risorsa.</w:t>
+      </w:r>
+    </w:p>
+    <w:bookmarkEnd w:id="128"/>
+    <w:bookmarkStart w:id="129" w:name="X95a55bfa3b77a5a4a3bc608be5dc95cf1ceb749"/>
+    <w:p>
+      <w:pPr>
+        <w:pStyle w:val="Heading3"/>
+      </w:pPr>
+      <w:r>
+        <w:t xml:space="preserve">WFM-010 â€” Visualizzazione codice commessa nella selezione assegnazione</w:t>
+      </w:r>
+    </w:p>
+    <w:p>
+      <w:pPr>
+        <w:pStyle w:val="FirstParagraph"/>
+      </w:pPr>
+      <w:r>
         <w:rPr>
           <w:b/>
           <w:bCs/>
         </w:rPr>
-        <w:t xml:space="preserve">WFM-005:</w:t>
-      </w:r>
-      <w:r>
-        <w:t xml:space="preserve"> </w:t>
-      </w:r>
-      <w:r>
-        <w:t xml:space="preserve">media allocazione e ore equivalenti per progetto in Dashboard;</w:t>
+        <w:t xml:space="preserve">Area:</w:t>
+      </w:r>
+      <w:r>
+        <w:t xml:space="preserve"> </w:t>
+      </w:r>
+      <w:r>
+        <w:t xml:space="preserve">Calendario / Assegnazioni Â·</w:t>
+      </w:r>
+      <w:r>
+        <w:t xml:space="preserve"> </w:t>
+      </w:r>
+      <w:r>
+        <w:rPr>
+          <w:b/>
+          <w:bCs/>
+        </w:rPr>
+        <w:t xml:space="preserve">PrioritÃ :</w:t>
+      </w:r>
+      <w:r>
+        <w:t xml:space="preserve"> </w:t>
+      </w:r>
+      <w:r>
+        <w:t xml:space="preserve">P1 Â·</w:t>
+      </w:r>
+      <w:r>
+        <w:t xml:space="preserve"> </w:t>
+      </w:r>
+      <w:r>
+        <w:rPr>
+          <w:b/>
+          <w:bCs/>
+        </w:rPr>
+        <w:t xml:space="preserve">Tipo:</w:t>
+      </w:r>
+      <w:r>
+        <w:t xml:space="preserve"> </w:t>
+      </w:r>
+      <w:r>
+        <w:t xml:space="preserve">UX</w:t>
+      </w:r>
+    </w:p>
+    <w:p>
+      <w:pPr>
+        <w:pStyle w:val="BodyText"/>
+      </w:pPr>
+      <w:r>
+        <w:t xml:space="preserve">Quando si assegna o si modifica un progetto nel Calendario (sia dal menu a</w:t>
+      </w:r>
+      <w:r>
+        <w:t xml:space="preserve"> </w:t>
+      </w:r>
+      <w:r>
+        <w:t xml:space="preserve">tendina della riga espansa, sia dal modale di assegnazione rapida /</w:t>
+      </w:r>
+      <w:r>
+        <w:t xml:space="preserve"> </w:t>
+      </w:r>
+      <w:r>
+        <w:t xml:space="preserve">AssignmentModal), mostrare chiaramente sia il</w:t>
+      </w:r>
+      <w:r>
+        <w:t xml:space="preserve"> </w:t>
+      </w:r>
+      <w:r>
+        <w:rPr>
+          <w:b/>
+          <w:bCs/>
+        </w:rPr>
+        <w:t xml:space="preserve">nome del progetto</w:t>
+      </w:r>
+      <w:r>
+        <w:t xml:space="preserve"> </w:t>
+      </w:r>
+      <w:r>
+        <w:t xml:space="preserve">sia il</w:t>
+      </w:r>
+      <w:r>
+        <w:t xml:space="preserve"> </w:t>
+      </w:r>
+      <w:r>
+        <w:t xml:space="preserve">relativo</w:t>
+      </w:r>
+      <w:r>
+        <w:t xml:space="preserve"> </w:t>
+      </w:r>
+      <w:r>
+        <w:rPr>
+          <w:b/>
+          <w:bCs/>
+        </w:rPr>
+        <w:t xml:space="preserve">codice commessa</w:t>
+      </w:r>
+      <w:r>
+        <w:t xml:space="preserve"> </w:t>
+      </w:r>
+      <w:r>
+        <w:t xml:space="preserve">(</w:t>
+      </w:r>
+      <w:r>
+        <w:rPr>
+          <w:rStyle w:val="VerbatimChar"/>
+        </w:rPr>
+        <w:t xml:space="preserve">commessaId</w:t>
+      </w:r>
+      <w:r>
+        <w:t xml:space="preserve">). Esempio:</w:t>
+      </w:r>
+      <w:r>
+        <w:t xml:space="preserve"> </w:t>
+      </w:r>
+      <w:r>
+        <w:rPr>
+          <w:i/>
+          <w:iCs/>
+        </w:rPr>
+        <w:t xml:space="preserve">Migrazione Cloud (migrazione-cloud-2026-09-04)</w:t>
+      </w:r>
+      <w:r>
+        <w:t xml:space="preserve">.</w:t>
+      </w:r>
+    </w:p>
+    <w:p>
+      <w:pPr>
+        <w:pStyle w:val="BodyText"/>
+      </w:pPr>
+      <w:r>
+        <w:rPr>
+          <w:b/>
+          <w:bCs/>
+        </w:rPr>
+        <w:t xml:space="preserve">Criteri di accettazione</w:t>
       </w:r>
     </w:p>
     <w:p>
@@ -15182,27 +15829,23 @@
         <w:pStyle w:val="Compact"/>
         <w:numPr>
           <w:ilvl w:val="0"/>
-          <w:numId w:val="1021"/>
+          <w:numId w:val="1022"/>
         </w:numPr>
       </w:pPr>
       <w:r>
-        <w:rPr>
-          <w:b/>
-          <w:bCs/>
-        </w:rPr>
-        <w:t xml:space="preserve">WFM-006:</w:t>
-      </w:r>
-      <w:r>
-        <w:t xml:space="preserve"> </w:t>
-      </w:r>
-      <w:r>
-        <w:t xml:space="preserve">visualizzazione assenze, durata oraria opzionale e blocco</w:t>
-      </w:r>
-      <w:r>
-        <w:t xml:space="preserve"> </w:t>
-      </w:r>
-      <w:r>
-        <w:t xml:space="preserve">server-side delle assegnazioni su assenze approvate;</w:t>
+        <w:t xml:space="preserve">nel dropdown di selezione del progetto delle righe assegnazione del Calendario, le opzioni mostrano formato esplicito</w:t>
+      </w:r>
+      <w:r>
+        <w:t xml:space="preserve"> </w:t>
+      </w:r>
+      <w:r>
+        <w:rPr>
+          <w:rStyle w:val="VerbatimChar"/>
+        </w:rPr>
+        <w:t xml:space="preserve">[Nome Progetto] (Commessa: [commessaId])</w:t>
+      </w:r>
+      <w:r>
+        <w:t xml:space="preserve">;</w:t>
       </w:r>
     </w:p>
     <w:p>
@@ -15210,7 +15853,81 @@
         <w:pStyle w:val="Compact"/>
         <w:numPr>
           <w:ilvl w:val="0"/>
-          <w:numId w:val="1021"/>
+          <w:numId w:val="1022"/>
+        </w:numPr>
+      </w:pPr>
+      <w:r>
+        <w:t xml:space="preserve">nel selettore progetto del modale</w:t>
+      </w:r>
+      <w:r>
+        <w:t xml:space="preserve"> </w:t>
+      </w:r>
+      <w:r>
+        <w:rPr>
+          <w:rStyle w:val="VerbatimChar"/>
+        </w:rPr>
+        <w:t xml:space="preserve">AssignmentModal</w:t>
+      </w:r>
+      <w:r>
+        <w:t xml:space="preserve">, ogni opzione include sia il nome del progetto sia l’identificativo commessa;</w:t>
+      </w:r>
+    </w:p>
+    <w:p>
+      <w:pPr>
+        <w:pStyle w:val="Compact"/>
+        <w:numPr>
+          <w:ilvl w:val="0"/>
+          <w:numId w:val="1022"/>
+        </w:numPr>
+      </w:pPr>
+      <w:r>
+        <w:t xml:space="preserve">nel tooltip informativo delle celle del calendario, accanto al nome progetto Ã¨ presente anche il codice commessa per disambiguare assegnazioni su progetti simili/omonimi;</w:t>
+      </w:r>
+    </w:p>
+    <w:p>
+      <w:pPr>
+        <w:pStyle w:val="Compact"/>
+        <w:numPr>
+          <w:ilvl w:val="0"/>
+          <w:numId w:val="1022"/>
+        </w:numPr>
+      </w:pPr>
+      <w:r>
+        <w:t xml:space="preserve">la selezione continua a salvare correttamente il</w:t>
+      </w:r>
+      <w:r>
+        <w:t xml:space="preserve"> </w:t>
+      </w:r>
+      <w:r>
+        <w:rPr>
+          <w:rStyle w:val="VerbatimChar"/>
+        </w:rPr>
+        <w:t xml:space="preserve">projectId</w:t>
+      </w:r>
+      <w:r>
+        <w:t xml:space="preserve"> </w:t>
+      </w:r>
+      <w:r>
+        <w:t xml:space="preserve">corrispondente senza regressioni.</w:t>
+      </w:r>
+    </w:p>
+    <w:bookmarkEnd w:id="129"/>
+    <w:bookmarkEnd w:id="130"/>
+    <w:bookmarkStart w:id="131" w:name="ordine-suggerito-di-rilascio"/>
+    <w:p>
+      <w:pPr>
+        <w:pStyle w:val="Heading2"/>
+      </w:pPr>
+      <w:r>
+        <w:t xml:space="preserve">Ordine suggerito di rilascio</w:t>
+      </w:r>
+    </w:p>
+    <w:p>
+      <w:pPr>
+        <w:pStyle w:val="Compact"/>
+        <w:numPr>
+          <w:ilvl w:val="0"/>
+          <w:numId w:val="1023"/>
         </w:numPr>
       </w:pPr>
       <w:r>
@@ -15218,13 +15935,374 @@
           <w:b/>
           <w:bCs/>
         </w:rPr>
+        <w:t xml:space="preserve">P0 â€” IntegritÃ  del calendario:</w:t>
+      </w:r>
+      <w:r>
+        <w:t xml:space="preserve"> </w:t>
+      </w:r>
+      <w:r>
+        <w:t xml:space="preserve">WFM-001 e WFM-006, includendo i</w:t>
+      </w:r>
+      <w:r>
+        <w:t xml:space="preserve"> </w:t>
+      </w:r>
+      <w:r>
+        <w:t xml:space="preserve">controlli server-side e i test sulle sovrapposizioni.</w:t>
+      </w:r>
+    </w:p>
+    <w:p>
+      <w:pPr>
+        <w:pStyle w:val="Compact"/>
+        <w:numPr>
+          <w:ilvl w:val="0"/>
+          <w:numId w:val="1023"/>
+        </w:numPr>
+      </w:pPr>
+      <w:r>
+        <w:rPr>
+          <w:b/>
+          <w:bCs/>
+        </w:rPr>
+        <w:t xml:space="preserve">P1 â€” OperativitÃ  quotidiana:</w:t>
+      </w:r>
+      <w:r>
+        <w:t xml:space="preserve"> </w:t>
+      </w:r>
+      <w:r>
+        <w:t xml:space="preserve">WFM-003, WFM-004 e WFM-007.</w:t>
+      </w:r>
+    </w:p>
+    <w:p>
+      <w:pPr>
+        <w:pStyle w:val="Compact"/>
+        <w:numPr>
+          <w:ilvl w:val="0"/>
+          <w:numId w:val="1023"/>
+        </w:numPr>
+      </w:pPr>
+      <w:r>
+        <w:rPr>
+          <w:b/>
+          <w:bCs/>
+        </w:rPr>
+        <w:t xml:space="preserve">P1 â€” Reporting:</w:t>
+      </w:r>
+      <w:r>
+        <w:t xml:space="preserve"> </w:t>
+      </w:r>
+      <w:r>
+        <w:t xml:space="preserve">WFM-005, dopo la decisione sulla definizione di</w:t>
+      </w:r>
+      <w:r>
+        <w:t xml:space="preserve"> </w:t>
+      </w:r>
+      <w:r>
+        <w:t xml:space="preserve">â€œproduttivitÃ â€.</w:t>
+      </w:r>
+    </w:p>
+    <w:p>
+      <w:pPr>
+        <w:pStyle w:val="Compact"/>
+        <w:numPr>
+          <w:ilvl w:val="0"/>
+          <w:numId w:val="1023"/>
+        </w:numPr>
+      </w:pPr>
+      <w:r>
+        <w:rPr>
+          <w:b/>
+          <w:bCs/>
+        </w:rPr>
+        <w:t xml:space="preserve">P1 â€” Supporto decisionale:</w:t>
+      </w:r>
+      <w:r>
+        <w:t xml:space="preserve"> </w:t>
+      </w:r>
+      <w:r>
+        <w:t xml:space="preserve">WFM-002, dopo la conferma della formula</w:t>
+      </w:r>
+      <w:r>
+        <w:t xml:space="preserve"> </w:t>
+      </w:r>
+      <w:r>
+        <w:t xml:space="preserve">ore/settimana â†’ ore/giorno.</w:t>
+      </w:r>
+    </w:p>
+    <w:bookmarkEnd w:id="131"/>
+    <w:bookmarkStart w:id="132" w:name="stato-implementazione-â-2026-09-11"/>
+    <w:p>
+      <w:pPr>
+        <w:pStyle w:val="Heading2"/>
+      </w:pPr>
+      <w:r>
+        <w:t xml:space="preserve">Stato implementazione â€” 2026-09-11</w:t>
+      </w:r>
+    </w:p>
+    <w:p>
+      <w:pPr>
+        <w:pStyle w:val="FirstParagraph"/>
+      </w:pPr>
+      <w:r>
+        <w:t xml:space="preserve">Gli item richiesti sono stati implementati nel codice corrente:</w:t>
+      </w:r>
+    </w:p>
+    <w:p>
+      <w:pPr>
+        <w:pStyle w:val="Compact"/>
+        <w:numPr>
+          <w:ilvl w:val="0"/>
+          <w:numId w:val="1024"/>
+        </w:numPr>
+      </w:pPr>
+      <w:r>
+        <w:rPr>
+          <w:b/>
+          <w:bCs/>
+        </w:rPr>
+        <w:t xml:space="preserve">WFM-001:</w:t>
+      </w:r>
+      <w:r>
+        <w:t xml:space="preserve"> </w:t>
+      </w:r>
+      <w:r>
+        <w:t xml:space="preserve">blocco server-side e disabilitazione UI sulle festivitÃ ;</w:t>
+      </w:r>
+    </w:p>
+    <w:p>
+      <w:pPr>
+        <w:pStyle w:val="Compact"/>
+        <w:numPr>
+          <w:ilvl w:val="0"/>
+          <w:numId w:val="1024"/>
+        </w:numPr>
+      </w:pPr>
+      <w:r>
+        <w:rPr>
+          <w:b/>
+          <w:bCs/>
+        </w:rPr>
+        <w:t xml:space="preserve">WFM-002:</w:t>
+      </w:r>
+      <w:r>
+        <w:t xml:space="preserve"> </w:t>
+      </w:r>
+      <w:r>
+        <w:t xml:space="preserve">tooltip percentuale/ore nel Calendario, con capacitÃ  su 5 giorni</w:t>
+      </w:r>
+      <w:r>
+        <w:t xml:space="preserve"> </w:t>
+      </w:r>
+      <w:r>
+        <w:t xml:space="preserve">lavorativi;</w:t>
+      </w:r>
+    </w:p>
+    <w:p>
+      <w:pPr>
+        <w:pStyle w:val="Compact"/>
+        <w:numPr>
+          <w:ilvl w:val="0"/>
+          <w:numId w:val="1024"/>
+        </w:numPr>
+      </w:pPr>
+      <w:r>
+        <w:rPr>
+          <w:b/>
+          <w:bCs/>
+        </w:rPr>
+        <w:t xml:space="preserve">WFM-003:</w:t>
+      </w:r>
+      <w:r>
+        <w:t xml:space="preserve"> </w:t>
+      </w:r>
+      <w:r>
+        <w:t xml:space="preserve">selezione e cancellazione multipla delle Persone;</w:t>
+      </w:r>
+    </w:p>
+    <w:p>
+      <w:pPr>
+        <w:pStyle w:val="Compact"/>
+        <w:numPr>
+          <w:ilvl w:val="0"/>
+          <w:numId w:val="1024"/>
+        </w:numPr>
+      </w:pPr>
+      <w:r>
+        <w:rPr>
+          <w:b/>
+          <w:bCs/>
+        </w:rPr>
+        <w:t xml:space="preserve">WFM-004:</w:t>
+      </w:r>
+      <w:r>
+        <w:t xml:space="preserve"> </w:t>
+      </w:r>
+      <w:r>
+        <w:t xml:space="preserve">filtro ricercabile multiselezione delle persone nel Calendario,</w:t>
+      </w:r>
+      <w:r>
+        <w:t xml:space="preserve"> </w:t>
+      </w:r>
+      <w:r>
+        <w:t xml:space="preserve">senza checkbox sulle righe;</w:t>
+      </w:r>
+    </w:p>
+    <w:p>
+      <w:pPr>
+        <w:pStyle w:val="Compact"/>
+        <w:numPr>
+          <w:ilvl w:val="0"/>
+          <w:numId w:val="1024"/>
+        </w:numPr>
+      </w:pPr>
+      <w:r>
+        <w:rPr>
+          <w:b/>
+          <w:bCs/>
+        </w:rPr>
+        <w:t xml:space="preserve">WFM-005:</w:t>
+      </w:r>
+      <w:r>
+        <w:t xml:space="preserve"> </w:t>
+      </w:r>
+      <w:r>
+        <w:t xml:space="preserve">media allocazione e ore equivalenti per progetto in Dashboard;</w:t>
+      </w:r>
+    </w:p>
+    <w:p>
+      <w:pPr>
+        <w:pStyle w:val="Compact"/>
+        <w:numPr>
+          <w:ilvl w:val="0"/>
+          <w:numId w:val="1024"/>
+        </w:numPr>
+      </w:pPr>
+      <w:r>
+        <w:rPr>
+          <w:b/>
+          <w:bCs/>
+        </w:rPr>
+        <w:t xml:space="preserve">WFM-006:</w:t>
+      </w:r>
+      <w:r>
+        <w:t xml:space="preserve"> </w:t>
+      </w:r>
+      <w:r>
+        <w:t xml:space="preserve">visualizzazione assenze, durata oraria opzionale e blocco</w:t>
+      </w:r>
+      <w:r>
+        <w:t xml:space="preserve"> </w:t>
+      </w:r>
+      <w:r>
+        <w:t xml:space="preserve">server-side delle assegnazioni su assenze approvate;</w:t>
+      </w:r>
+    </w:p>
+    <w:p>
+      <w:pPr>
+        <w:pStyle w:val="Compact"/>
+        <w:numPr>
+          <w:ilvl w:val="0"/>
+          <w:numId w:val="1024"/>
+        </w:numPr>
+      </w:pPr>
+      <w:r>
+        <w:rPr>
+          <w:b/>
+          <w:bCs/>
+        </w:rPr>
         <w:t xml:space="preserve">WFM-007:</w:t>
       </w:r>
       <w:r>
         <w:t xml:space="preserve"> </w:t>
       </w:r>
       <w:r>
-        <w:t xml:space="preserve">filtro Staffing per tutto/settimana/mese/anno.</w:t>
+        <w:t xml:space="preserve">filtro Staffing per tutto/settimana/mese/anno;</w:t>
+      </w:r>
+    </w:p>
+    <w:p>
+      <w:pPr>
+        <w:pStyle w:val="Compact"/>
+        <w:numPr>
+          <w:ilvl w:val="0"/>
+          <w:numId w:val="1024"/>
+        </w:numPr>
+      </w:pPr>
+      <w:r>
+        <w:rPr>
+          <w:b/>
+          <w:bCs/>
+        </w:rPr>
+        <w:t xml:space="preserve">WFM-008:</w:t>
+      </w:r>
+      <w:r>
+        <w:t xml:space="preserve"> </w:t>
+      </w:r>
+      <w:r>
+        <w:t xml:space="preserve">inclusione/esclusione configurabile dei contractor dalla produttivitÃ  mensile in Dashboard e Impostazioni;</w:t>
+      </w:r>
+    </w:p>
+    <w:p>
+      <w:pPr>
+        <w:pStyle w:val="Compact"/>
+        <w:numPr>
+          <w:ilvl w:val="0"/>
+          <w:numId w:val="1024"/>
+        </w:numPr>
+      </w:pPr>
+      <w:r>
+        <w:rPr>
+          <w:b/>
+          <w:bCs/>
+        </w:rPr>
+        <w:t xml:space="preserve">WFM-009:</w:t>
+      </w:r>
+      <w:r>
+        <w:t xml:space="preserve"> </w:t>
+      </w:r>
+      <w:r>
+        <w:t xml:space="preserve">visualizzazione del tipo persona (badge e tooltip</w:t>
+      </w:r>
+      <w:r>
+        <w:t xml:space="preserve"> </w:t>
+      </w:r>
+      <w:r>
+        <w:rPr>
+          <w:rStyle w:val="VerbatimChar"/>
+        </w:rPr>
+        <w:t xml:space="preserve">Nome (Tipo) - Ruolo</w:t>
+      </w:r>
+      <w:r>
+        <w:t xml:space="preserve">) nel Calendario e filtro persone arricchito;</w:t>
+      </w:r>
+    </w:p>
+    <w:p>
+      <w:pPr>
+        <w:pStyle w:val="Compact"/>
+        <w:numPr>
+          <w:ilvl w:val="0"/>
+          <w:numId w:val="1024"/>
+        </w:numPr>
+      </w:pPr>
+      <w:r>
+        <w:rPr>
+          <w:b/>
+          <w:bCs/>
+        </w:rPr>
+        <w:t xml:space="preserve">WFM-010:</w:t>
+      </w:r>
+      <w:r>
+        <w:t xml:space="preserve"> </w:t>
+      </w:r>
+      <w:r>
+        <w:t xml:space="preserve">visualizzazione del codice commessa (</w:t>
+      </w:r>
+      <w:r>
+        <w:rPr>
+          <w:rStyle w:val="VerbatimChar"/>
+        </w:rPr>
+        <w:t xml:space="preserve">commessaId</w:t>
+      </w:r>
+      <w:r>
+        <w:t xml:space="preserve">) nella selezione progetto per le assegnazioni nel Calendario e nel modale di assegnazione.</w:t>
       </w:r>
     </w:p>
     <w:p>
@@ -15244,29 +16322,41 @@
         <w:t xml:space="preserve"> </w:t>
       </w:r>
       <w:r>
-        <w:t xml:space="preserve">allocazione fino a quando non esiste un dato consuntivo; la capacitÃ </w:t>
-      </w:r>
-      <w:r>
-        <w:t xml:space="preserve"> </w:t>
-      </w:r>
-      <w:r>
-        <w:t xml:space="preserve">giornaliera usa la settimana lavorativa di 5 giorni; un’assenza oraria Ã¨</w:t>
-      </w:r>
-      <w:r>
-        <w:t xml:space="preserve"> </w:t>
-      </w:r>
-      <w:r>
-        <w:t xml:space="preserve">ammessa su una singola giornata e, come regola prudenziale, una volta</w:t>
-      </w:r>
-      <w:r>
-        <w:t xml:space="preserve"> </w:t>
-      </w:r>
-      <w:r>
-        <w:t xml:space="preserve">approvata blocca l’intera giornata di staffing.</w:t>
-      </w:r>
-    </w:p>
-    <w:bookmarkEnd w:id="129"/>
-    <w:bookmarkStart w:id="130" w:name="decisioni-aperte"/>
+        <w:t xml:space="preserve">allocazione fino a quando non esiste un dato consuntivo; l’inclusione dei</w:t>
+      </w:r>
+      <w:r>
+        <w:t xml:space="preserve"> </w:t>
+      </w:r>
+      <w:r>
+        <w:t xml:space="preserve">contractor nella produttivitÃ  mensile Ã¨ configurabile sia a livello globale</w:t>
+      </w:r>
+      <w:r>
+        <w:t xml:space="preserve"> </w:t>
+      </w:r>
+      <w:r>
+        <w:t xml:space="preserve">che tramite switch rapido in Dashboard; la capacitÃ  giornaliera usa la</w:t>
+      </w:r>
+      <w:r>
+        <w:t xml:space="preserve"> </w:t>
+      </w:r>
+      <w:r>
+        <w:t xml:space="preserve">settimana lavorativa di 5 giorni; un’assenza oraria Ã¨ ammessa su una singola</w:t>
+      </w:r>
+      <w:r>
+        <w:t xml:space="preserve"> </w:t>
+      </w:r>
+      <w:r>
+        <w:t xml:space="preserve">giornata e, come regola prudenziale, una volta approvata blocca l’intera</w:t>
+      </w:r>
+      <w:r>
+        <w:t xml:space="preserve"> </w:t>
+      </w:r>
+      <w:r>
+        <w:t xml:space="preserve">giornata di staffing.</w:t>
+      </w:r>
+    </w:p>
+    <w:bookmarkEnd w:id="132"/>
+    <w:bookmarkStart w:id="133" w:name="decisioni-aperte"/>
     <w:p>
       <w:pPr>
         <w:pStyle w:val="Heading2"/>
@@ -15466,8 +16556,8 @@
         </w:tc>
       </w:tr>
     </w:tbl>
-    <w:bookmarkEnd w:id="130"/>
-    <w:bookmarkEnd w:id="131"/>
+    <w:bookmarkEnd w:id="133"/>
+    <w:bookmarkEnd w:id="134"/>
     <w:sectPr>
       <w:footnotePr>
         <w:numRestart w:val="eachSect"/>
@@ -15881,6 +16971,15 @@
     <w:abstractNumId w:val="991"/>
   </w:num>
   <w:num w:numId="1020">
+    <w:abstractNumId w:val="991"/>
+  </w:num>
+  <w:num w:numId="1021">
+    <w:abstractNumId w:val="991"/>
+  </w:num>
+  <w:num w:numId="1022">
+    <w:abstractNumId w:val="991"/>
+  </w:num>
+  <w:num w:numId="1023">
     <w:abstractNumId w:val="99411"/>
     <w:lvlOverride w:ilvl="0">
       <w:startOverride w:val="1"/>
@@ -15910,7 +17009,7 @@
       <w:startOverride w:val="1"/>
     </w:lvlOverride>
   </w:num>
-  <w:num w:numId="1021">
+  <w:num w:numId="1024">
     <w:abstractNumId w:val="991"/>
   </w:num>
 </w:numbering>

</xml_diff>

<commit_message>
fix(security): enforce MFA and harden production
Require TOTP enrollment before issuing sessions and default new users to dashboard-only access. Add Helmet headers and update vulnerable production dependencies. Existing users must enroll MFA after deployment.
</commit_message>
<xml_diff>
--- a/docs/WorkForce-Manager-Documentazione.docx
+++ b/docs/WorkForce-Manager-Documentazione.docx
@@ -23,7 +23,7 @@
         <w:pStyle w:val="Date"/>
       </w:pPr>
       <w:r>
-        <w:t xml:space="preserve">2026-09-11</w:t>
+        <w:t xml:space="preserve">2026-10-05</w:t>
       </w:r>
     </w:p>
     <w:sdt>
@@ -3501,22 +3501,13 @@
         <w:t xml:space="preserve"> </w:t>
       </w:r>
       <w:r>
-        <w:t xml:space="preserve">generano mai HTML, l’accesso ai dati passa quasi sempre da Drizzle. Le due</w:t>
-      </w:r>
-      <w:r>
-        <w:t xml:space="preserve"> </w:t>
-      </w:r>
-      <w:r>
-        <w:t xml:space="preserve">sole eccezioni con SQL grezzo (</w:t>
-      </w:r>
-      <w:r>
-        <w:rPr>
-          <w:rStyle w:val="VerbatimChar"/>
-        </w:rPr>
-        <w:t xml:space="preserve">pool.query</w:t>
-      </w:r>
-      <w:r>
-        <w:t xml:space="preserve">) sono entrambe un</w:t>
+        <w:t xml:space="preserve">generano mai HTML, l’accesso ai dati passa sempre da Drizzle (mai SQL grezzo</w:t>
+      </w:r>
+      <w:r>
+        <w:t xml:space="preserve"> </w:t>
+      </w:r>
+      <w:r>
+        <w:t xml:space="preserve">sparso nei router, salvo il singolo</w:t>
       </w:r>
       <w:r>
         <w:t xml:space="preserve"> </w:t>
@@ -3528,22 +3519,16 @@
         <w:t xml:space="preserve">TRUNCATE</w:t>
       </w:r>
       <w:r>
-        <w:t xml:space="preserve">:</w:t>
-      </w:r>
-      <w:r>
-        <w:t xml:space="preserve"> </w:t>
-      </w:r>
-      <w:r>
-        <w:t xml:space="preserve">quello usato nell’harness dei test (</w:t>
-      </w:r>
-      <w:r>
-        <w:rPr>
-          <w:rStyle w:val="VerbatimChar"/>
-        </w:rPr>
-        <w:t xml:space="preserve">tests/integration/helpers.ts</w:t>
-      </w:r>
-      <w:r>
-        <w:t xml:space="preserve">, vedi</w:t>
+        <w:t xml:space="preserve"> </w:t>
+      </w:r>
+      <w:r>
+        <w:t xml:space="preserve">usato solo nell’harness dei</w:t>
+      </w:r>
+      <w:r>
+        <w:t xml:space="preserve"> </w:t>
+      </w:r>
+      <w:r>
+        <w:t xml:space="preserve">test â€” vedi</w:t>
       </w:r>
       <w:r>
         <w:t xml:space="preserve"> </w:t>
@@ -3557,70 +3542,7 @@
         </w:r>
       </w:hyperlink>
       <w:r>
-        <w:t xml:space="preserve">) e quello dietro l’endpoint</w:t>
-      </w:r>
-      <w:r>
-        <w:t xml:space="preserve"> </w:t>
-      </w:r>
-      <w:r>
-        <w:t xml:space="preserve">amministrativo</w:t>
-      </w:r>
-      <w:r>
-        <w:t xml:space="preserve"> </w:t>
-      </w:r>
-      <w:r>
-        <w:rPr>
-          <w:rStyle w:val="VerbatimChar"/>
-        </w:rPr>
-        <w:t xml:space="preserve">POST /api/admin/reset-data</w:t>
-      </w:r>
-      <w:r>
-        <w:t xml:space="preserve"> </w:t>
-      </w:r>
-      <w:r>
-        <w:t xml:space="preserve">(</w:t>
-      </w:r>
-      <w:r>
-        <w:rPr>
-          <w:rStyle w:val="VerbatimChar"/>
-        </w:rPr>
-        <w:t xml:space="preserve">server/routes/admin.ts</w:t>
-      </w:r>
-      <w:r>
-        <w:t xml:space="preserve">) â€” quest’ultimo Ã¨ codice applicativo di</w:t>
-      </w:r>
-      <w:r>
-        <w:t xml:space="preserve"> </w:t>
-      </w:r>
-      <w:r>
-        <w:t xml:space="preserve">produzione, non solo di test, e tronca tutte le tabelle dati in un unico</w:t>
-      </w:r>
-      <w:r>
-        <w:t xml:space="preserve"> </w:t>
-      </w:r>
-      <w:r>
-        <w:t xml:space="preserve">statement (necessario per evitare deadlock da lock</w:t>
-      </w:r>
-      <w:r>
-        <w:t xml:space="preserve"> </w:t>
-      </w:r>
-      <w:r>
-        <w:rPr>
-          <w:rStyle w:val="VerbatimChar"/>
-        </w:rPr>
-        <w:t xml:space="preserve">CASCADE</w:t>
-      </w:r>
-      <w:r>
-        <w:t xml:space="preserve"> </w:t>
-      </w:r>
-      <w:r>
-        <w:t xml:space="preserve">su tabelle in</w:t>
-      </w:r>
-      <w:r>
-        <w:t xml:space="preserve"> </w:t>
-      </w:r>
-      <w:r>
-        <w:t xml:space="preserve">comune se eseguito come query separate in parallelo).</w:t>
+        <w:t xml:space="preserve">).</w:t>
       </w:r>
     </w:p>
     <w:bookmarkEnd w:id="49"/>
@@ -3784,7 +3706,7 @@
       <w:r>
         <w:drawing>
           <wp:inline>
-            <wp:extent cx="5067300" cy="2662917"/>
+            <wp:extent cx="5067300" cy="2798649"/>
             <wp:effectExtent b="0" l="0" r="0" t="0"/>
             <wp:docPr descr="" title="" id="56" name="Picture"/>
             <a:graphic>
@@ -3805,7 +3727,7 @@
                   <pic:spPr bwMode="auto">
                     <a:xfrm>
                       <a:off x="0" y="0"/>
-                      <a:ext cx="5067300" cy="2662917"/>
+                      <a:ext cx="5067300" cy="2798649"/>
                     </a:xfrm>
                     <a:prstGeom prst="rect">
                       <a:avLst/>
@@ -4498,7 +4420,7 @@
       <w:r>
         <w:drawing>
           <wp:inline>
-            <wp:extent cx="5067300" cy="4485594"/>
+            <wp:extent cx="5067300" cy="4556691"/>
             <wp:effectExtent b="0" l="0" r="0" t="0"/>
             <wp:docPr descr="" title="" id="65" name="Picture"/>
             <a:graphic>
@@ -4519,7 +4441,7 @@
                   <pic:spPr bwMode="auto">
                     <a:xfrm>
                       <a:off x="0" y="0"/>
-                      <a:ext cx="5067300" cy="4485594"/>
+                      <a:ext cx="5067300" cy="4556691"/>
                     </a:xfrm>
                     <a:prstGeom prst="rect">
                       <a:avLst/>
@@ -4859,85 +4781,6 @@
         <w:t xml:space="preserve">.</w:t>
       </w:r>
     </w:p>
-    <w:p>
-      <w:pPr>
-        <w:pStyle w:val="BodyText"/>
-      </w:pPr>
-      <w:r>
-        <w:t xml:space="preserve">Il diagramma sopra mostra solo la pipeline di deploy (</w:t>
-      </w:r>
-      <w:r>
-        <w:rPr>
-          <w:rStyle w:val="VerbatimChar"/>
-        </w:rPr>
-        <w:t xml:space="preserve">deploy.yml</w:t>
-      </w:r>
-      <w:r>
-        <w:t xml:space="preserve">). Un</w:t>
-      </w:r>
-      <w:r>
-        <w:t xml:space="preserve"> </w:t>
-      </w:r>
-      <w:r>
-        <w:t xml:space="preserve">secondo workflow indipendente,</w:t>
-      </w:r>
-      <w:r>
-        <w:t xml:space="preserve"> </w:t>
-      </w:r>
-      <w:r>
-        <w:rPr>
-          <w:rStyle w:val="VerbatimChar"/>
-        </w:rPr>
-        <w:t xml:space="preserve">sonar.yml</w:t>
-      </w:r>
-      <w:r>
-        <w:t xml:space="preserve">, esegue l’analisi SonarQube</w:t>
-      </w:r>
-      <w:r>
-        <w:t xml:space="preserve"> </w:t>
-      </w:r>
-      <w:r>
-        <w:t xml:space="preserve">(anch’esso con un Postgres effimero, per far girare i test di integrazione</w:t>
-      </w:r>
-      <w:r>
-        <w:t xml:space="preserve"> </w:t>
-      </w:r>
-      <w:r>
-        <w:t xml:space="preserve">e produrre la coverage) ma non fa parte della catena che porta al deploy:</w:t>
-      </w:r>
-      <w:r>
-        <w:t xml:space="preserve"> </w:t>
-      </w:r>
-      <w:r>
-        <w:t xml:space="preserve">non blocca nÃ© viene bloccato da</w:t>
-      </w:r>
-      <w:r>
-        <w:t xml:space="preserve"> </w:t>
-      </w:r>
-      <w:r>
-        <w:rPr>
-          <w:rStyle w:val="VerbatimChar"/>
-        </w:rPr>
-        <w:t xml:space="preserve">build-and-deploy</w:t>
-      </w:r>
-      <w:r>
-        <w:t xml:space="preserve">. Dettagli in</w:t>
-      </w:r>
-      <w:r>
-        <w:t xml:space="preserve"> </w:t>
-      </w:r>
-      <w:hyperlink r:id="rId80">
-        <w:r>
-          <w:rPr>
-            <w:rStyle w:val="Hyperlink"/>
-          </w:rPr>
-          <w:t xml:space="preserve">03-tecnica.md Â§CI/CD</w:t>
-        </w:r>
-      </w:hyperlink>
-      <w:r>
-        <w:t xml:space="preserve">.</w:t>
-      </w:r>
-    </w:p>
     <w:bookmarkEnd w:id="81"/>
     <w:bookmarkStart w:id="83" w:name="decisioni-architetturali-chiave"/>
     <w:p>
@@ -5686,7 +5529,7 @@
               <w:pStyle w:val="Compact"/>
             </w:pPr>
             <w:r>
-              <w:t xml:space="preserve">0.31.x</w:t>
+              <w:t xml:space="preserve">0.45.x</w:t>
             </w:r>
           </w:p>
         </w:tc>
@@ -5721,7 +5564,7 @@
               <w:pStyle w:val="Compact"/>
             </w:pPr>
             <w:r>
-              <w:t xml:space="preserve">0.22.8</w:t>
+              <w:t xml:space="preserve">0.31.x</w:t>
             </w:r>
           </w:p>
         </w:tc>
@@ -5769,29 +5612,29 @@
               <w:pStyle w:val="Compact"/>
             </w:pPr>
             <w:r>
-              <w:t xml:space="preserve">pg (node-postgres)</w:t>
-            </w:r>
-          </w:p>
-        </w:tc>
-        <w:tc>
-          <w:tcPr/>
-          <w:p>
-            <w:pPr>
-              <w:pStyle w:val="Compact"/>
-            </w:pPr>
-            <w:r>
-              <w:t xml:space="preserve">8.12.0</w:t>
-            </w:r>
-          </w:p>
-        </w:tc>
-        <w:tc>
-          <w:tcPr/>
-          <w:p>
-            <w:pPr>
-              <w:pStyle w:val="Compact"/>
-            </w:pPr>
-            <w:r>
-              <w:t xml:space="preserve">Driver PostgreSQL</w:t>
+              <w:t xml:space="preserve">Helmet</w:t>
+            </w:r>
+          </w:p>
+        </w:tc>
+        <w:tc>
+          <w:tcPr/>
+          <w:p>
+            <w:pPr>
+              <w:pStyle w:val="Compact"/>
+            </w:pPr>
+            <w:r>
+              <w:t xml:space="preserve">8.x</w:t>
+            </w:r>
+          </w:p>
+        </w:tc>
+        <w:tc>
+          <w:tcPr/>
+          <w:p>
+            <w:pPr>
+              <w:pStyle w:val="Compact"/>
+            </w:pPr>
+            <w:r>
+              <w:t xml:space="preserve">Header HTTP di sicurezza</w:t>
             </w:r>
           </w:p>
         </w:tc>
@@ -5804,29 +5647,29 @@
               <w:pStyle w:val="Compact"/>
             </w:pPr>
             <w:r>
-              <w:t xml:space="preserve">jsonwebtoken</w:t>
-            </w:r>
-          </w:p>
-        </w:tc>
-        <w:tc>
-          <w:tcPr/>
-          <w:p>
-            <w:pPr>
-              <w:pStyle w:val="Compact"/>
-            </w:pPr>
-            <w:r>
-              <w:t xml:space="preserve">9.0.2</w:t>
-            </w:r>
-          </w:p>
-        </w:tc>
-        <w:tc>
-          <w:tcPr/>
-          <w:p>
-            <w:pPr>
-              <w:pStyle w:val="Compact"/>
-            </w:pPr>
-            <w:r>
-              <w:t xml:space="preserve">Firma/verifica sessioni JWT</w:t>
+              <w:t xml:space="preserve">pg (node-postgres)</w:t>
+            </w:r>
+          </w:p>
+        </w:tc>
+        <w:tc>
+          <w:tcPr/>
+          <w:p>
+            <w:pPr>
+              <w:pStyle w:val="Compact"/>
+            </w:pPr>
+            <w:r>
+              <w:t xml:space="preserve">8.12.0</w:t>
+            </w:r>
+          </w:p>
+        </w:tc>
+        <w:tc>
+          <w:tcPr/>
+          <w:p>
+            <w:pPr>
+              <w:pStyle w:val="Compact"/>
+            </w:pPr>
+            <w:r>
+              <w:t xml:space="preserve">Driver PostgreSQL</w:t>
             </w:r>
           </w:p>
         </w:tc>
@@ -5839,6 +5682,41 @@
               <w:pStyle w:val="Compact"/>
             </w:pPr>
             <w:r>
+              <w:t xml:space="preserve">jsonwebtoken</w:t>
+            </w:r>
+          </w:p>
+        </w:tc>
+        <w:tc>
+          <w:tcPr/>
+          <w:p>
+            <w:pPr>
+              <w:pStyle w:val="Compact"/>
+            </w:pPr>
+            <w:r>
+              <w:t xml:space="preserve">9.0.2</w:t>
+            </w:r>
+          </w:p>
+        </w:tc>
+        <w:tc>
+          <w:tcPr/>
+          <w:p>
+            <w:pPr>
+              <w:pStyle w:val="Compact"/>
+            </w:pPr>
+            <w:r>
+              <w:t xml:space="preserve">Firma/verifica sessioni JWT</w:t>
+            </w:r>
+          </w:p>
+        </w:tc>
+      </w:tr>
+      <w:tr>
+        <w:tc>
+          <w:tcPr/>
+          <w:p>
+            <w:pPr>
+              <w:pStyle w:val="Compact"/>
+            </w:pPr>
+            <w:r>
               <w:t xml:space="preserve">bcryptjs</w:t>
             </w:r>
           </w:p>
@@ -5862,6 +5740,76 @@
             </w:pPr>
             <w:r>
               <w:t xml:space="preserve">Hashing password</w:t>
+            </w:r>
+          </w:p>
+        </w:tc>
+      </w:tr>
+      <w:tr>
+        <w:tc>
+          <w:tcPr/>
+          <w:p>
+            <w:pPr>
+              <w:pStyle w:val="Compact"/>
+            </w:pPr>
+            <w:r>
+              <w:t xml:space="preserve">express-rate-limit</w:t>
+            </w:r>
+          </w:p>
+        </w:tc>
+        <w:tc>
+          <w:tcPr/>
+          <w:p>
+            <w:pPr>
+              <w:pStyle w:val="Compact"/>
+            </w:pPr>
+            <w:r>
+              <w:t xml:space="preserve">8.x</w:t>
+            </w:r>
+          </w:p>
+        </w:tc>
+        <w:tc>
+          <w:tcPr/>
+          <w:p>
+            <w:pPr>
+              <w:pStyle w:val="Compact"/>
+            </w:pPr>
+            <w:r>
+              <w:t xml:space="preserve">Limitazione dei tentativi di login per IP</w:t>
+            </w:r>
+          </w:p>
+        </w:tc>
+      </w:tr>
+      <w:tr>
+        <w:tc>
+          <w:tcPr/>
+          <w:p>
+            <w:pPr>
+              <w:pStyle w:val="Compact"/>
+            </w:pPr>
+            <w:r>
+              <w:t xml:space="preserve">otplib</w:t>
+            </w:r>
+          </w:p>
+        </w:tc>
+        <w:tc>
+          <w:tcPr/>
+          <w:p>
+            <w:pPr>
+              <w:pStyle w:val="Compact"/>
+            </w:pPr>
+            <w:r>
+              <w:t xml:space="preserve">13.x</w:t>
+            </w:r>
+          </w:p>
+        </w:tc>
+        <w:tc>
+          <w:tcPr/>
+          <w:p>
+            <w:pPr>
+              <w:pStyle w:val="Compact"/>
+            </w:pPr>
+            <w:r>
+              <w:t xml:space="preserve">Generazione e verifica codici TOTP per MFA</w:t>
             </w:r>
           </w:p>
         </w:tc>
@@ -6180,7 +6128,7 @@
               <w:pStyle w:val="Compact"/>
             </w:pPr>
             <w:r>
-              <w:t xml:space="preserve">4.1.10</w:t>
+              <w:t xml:space="preserve">4.1.11</w:t>
             </w:r>
           </w:p>
         </w:tc>
@@ -6215,7 +6163,7 @@
               <w:pStyle w:val="Compact"/>
             </w:pPr>
             <w:r>
-              <w:t xml:space="preserve">4.1.10</w:t>
+              <w:t xml:space="preserve">4.1.11</w:t>
             </w:r>
           </w:p>
         </w:tc>
@@ -7403,6 +7351,18 @@
               <w:rPr>
                 <w:rStyle w:val="VerbatimChar"/>
               </w:rPr>
+              <w:t xml:space="preserve">POST /auth/mfa/verify</w:t>
+            </w:r>
+            <w:r>
+              <w:t xml:space="preserve">,</w:t>
+            </w:r>
+            <w:r>
+              <w:t xml:space="preserve"> </w:t>
+            </w:r>
+            <w:r>
+              <w:rPr>
+                <w:rStyle w:val="VerbatimChar"/>
+              </w:rPr>
               <w:t xml:space="preserve">POST /auth/logout</w:t>
             </w:r>
             <w:r>
@@ -7426,7 +7386,7 @@
               <w:pStyle w:val="Compact"/>
             </w:pPr>
             <w:r>
-              <w:t xml:space="preserve">pubblico</w:t>
+              <w:t xml:space="preserve">login pubblico; MFA setup/confirm/disable autenticati</w:t>
             </w:r>
           </w:p>
         </w:tc>
@@ -9834,13 +9794,7 @@
         <w:t xml:space="preserve"> </w:t>
       </w:r>
       <w:r>
-        <w:t xml:space="preserve">produzione (richiede HTTPS, garantito dal terminamento TLS di Azure App</w:t>
-      </w:r>
-      <w:r>
-        <w:t xml:space="preserve"> </w:t>
-      </w:r>
-      <w:r>
-        <w:t xml:space="preserve">Service), durata</w:t>
+        <w:t xml:space="preserve">produzione (richiede HTTPS, forzato dall’App Service), durata</w:t>
       </w:r>
       <w:r>
         <w:t xml:space="preserve"> </w:t>
@@ -9850,7 +9804,26 @@
           <w:b/>
           <w:bCs/>
         </w:rPr>
-        <w:t xml:space="preserve">7 giorni</w:t>
+        <w:t xml:space="preserve">8 ore</w:t>
+      </w:r>
+      <w:r>
+        <w:t xml:space="preserve">.</w:t>
+      </w:r>
+      <w:r>
+        <w:t xml:space="preserve"> </w:t>
+      </w:r>
+      <w:r>
+        <w:t xml:space="preserve">Il client esegue inoltre il logout dopo</w:t>
+      </w:r>
+      <w:r>
+        <w:t xml:space="preserve"> </w:t>
+      </w:r>
+      <w:r>
+        <w:rPr>
+          <w:b/>
+          <w:bCs/>
+        </w:rPr>
+        <w:t xml:space="preserve">30 minuti di inattivitÃ </w:t>
       </w:r>
       <w:r>
         <w:t xml:space="preserve">.</w:t>
@@ -9869,52 +9842,37 @@
           <w:b/>
           <w:bCs/>
         </w:rPr>
-        <w:t xml:space="preserve">Password</w:t>
-      </w:r>
-      <w:r>
-        <w:t xml:space="preserve">: hashing con</w:t>
-      </w:r>
-      <w:r>
-        <w:t xml:space="preserve"> </w:t>
-      </w:r>
-      <w:r>
-        <w:rPr>
-          <w:rStyle w:val="VerbatimChar"/>
-        </w:rPr>
-        <w:t xml:space="preserve">bcryptjs</w:t>
-      </w:r>
-      <w:r>
-        <w:t xml:space="preserve">, cost factor 10 (default). Nessuna</w:t>
-      </w:r>
-      <w:r>
-        <w:t xml:space="preserve"> </w:t>
-      </w:r>
-      <w:r>
-        <w:t xml:space="preserve">password in chiaro viene mai loggata o restituita dalle API (le query di</w:t>
-      </w:r>
-      <w:r>
-        <w:t xml:space="preserve"> </w:t>
-      </w:r>
-      <w:r>
-        <w:t xml:space="preserve">lettura utenti proiettano esplicitamente solo le colonne necessarie,</w:t>
-      </w:r>
-      <w:r>
-        <w:t xml:space="preserve"> </w:t>
-      </w:r>
-      <w:r>
-        <w:t xml:space="preserve">escludendo</w:t>
-      </w:r>
-      <w:r>
-        <w:t xml:space="preserve"> </w:t>
-      </w:r>
-      <w:r>
-        <w:rPr>
-          <w:rStyle w:val="VerbatimChar"/>
-        </w:rPr>
-        <w:t xml:space="preserve">password_hash</w:t>
-      </w:r>
-      <w:r>
-        <w:t xml:space="preserve">).</w:t>
+        <w:t xml:space="preserve">Header HTTP</w:t>
+      </w:r>
+      <w:r>
+        <w:t xml:space="preserve">: Helmet imposta CSP, HSTS, anti-framing,</w:t>
+      </w:r>
+      <w:r>
+        <w:t xml:space="preserve"> </w:t>
+      </w:r>
+      <w:r>
+        <w:rPr>
+          <w:rStyle w:val="VerbatimChar"/>
+        </w:rPr>
+        <w:t xml:space="preserve">nosniff</w:t>
+      </w:r>
+      <w:r>
+        <w:t xml:space="preserve"> </w:t>
+      </w:r>
+      <w:r>
+        <w:t xml:space="preserve">e gli</w:t>
+      </w:r>
+      <w:r>
+        <w:t xml:space="preserve"> </w:t>
+      </w:r>
+      <w:r>
+        <w:t xml:space="preserve">altri header predefiniti; l’App Service accetta HTTP solo per reindirizzarlo</w:t>
+      </w:r>
+      <w:r>
+        <w:t xml:space="preserve"> </w:t>
+      </w:r>
+      <w:r>
+        <w:t xml:space="preserve">a HTTPS e richiede TLS 1.2 o superiore.</w:t>
       </w:r>
     </w:p>
     <w:p>
@@ -9930,114 +9888,296 @@
           <w:b/>
           <w:bCs/>
         </w:rPr>
-        <w:t xml:space="preserve">Verifica continua, non solo al login</w:t>
-      </w:r>
-      <w:r>
-        <w:t xml:space="preserve">:</w:t>
-      </w:r>
-      <w:r>
-        <w:t xml:space="preserve"> </w:t>
-      </w:r>
-      <w:r>
-        <w:rPr>
-          <w:rStyle w:val="VerbatimChar"/>
-        </w:rPr>
-        <w:t xml:space="preserve">attachUser</w:t>
-      </w:r>
-      <w:r>
-        <w:t xml:space="preserve"> </w:t>
-      </w:r>
-      <w:r>
-        <w:t xml:space="preserve">(middleware</w:t>
-      </w:r>
-      <w:r>
-        <w:t xml:space="preserve"> </w:t>
-      </w:r>
-      <w:r>
-        <w:t xml:space="preserve">eseguito su ogni richiesta)</w:t>
-      </w:r>
-      <w:r>
-        <w:t xml:space="preserve"> </w:t>
-      </w:r>
+        <w:t xml:space="preserve">Password</w:t>
+      </w:r>
+      <w:r>
+        <w:t xml:space="preserve">: hashing con</w:t>
+      </w:r>
+      <w:r>
+        <w:t xml:space="preserve"> </w:t>
+      </w:r>
+      <w:r>
+        <w:rPr>
+          <w:rStyle w:val="VerbatimChar"/>
+        </w:rPr>
+        <w:t xml:space="preserve">bcryptjs</w:t>
+      </w:r>
+      <w:r>
+        <w:t xml:space="preserve">, cost factor 10 (default). Nessuna</w:t>
+      </w:r>
+      <w:r>
+        <w:t xml:space="preserve"> </w:t>
+      </w:r>
+      <w:r>
+        <w:t xml:space="preserve">password in chiaro viene restituita dalle API o scritta nei log applicativi</w:t>
+      </w:r>
+      <w:r>
+        <w:t xml:space="preserve"> </w:t>
+      </w:r>
+      <w:r>
+        <w:t xml:space="preserve">(le query di lettura utenti proiettano esplicitamente solo le colonne</w:t>
+      </w:r>
+      <w:r>
+        <w:t xml:space="preserve"> </w:t>
+      </w:r>
+      <w:r>
+        <w:t xml:space="preserve">necessarie, escludendo</w:t>
+      </w:r>
+      <w:r>
+        <w:t xml:space="preserve"> </w:t>
+      </w:r>
+      <w:r>
+        <w:rPr>
+          <w:rStyle w:val="VerbatimChar"/>
+        </w:rPr>
+        <w:t xml:space="preserve">password_hash</w:t>
+      </w:r>
+      <w:r>
+        <w:t xml:space="preserve">; il seed stampa solo l’email).</w:t>
+      </w:r>
+    </w:p>
+    <w:p>
+      <w:pPr>
+        <w:pStyle w:val="Compact"/>
+        <w:numPr>
+          <w:ilvl w:val="0"/>
+          <w:numId w:val="1009"/>
+        </w:numPr>
+      </w:pPr>
       <w:r>
         <w:rPr>
           <w:b/>
           <w:bCs/>
         </w:rPr>
-        <w:t xml:space="preserve">ri-legge da database</w:t>
-      </w:r>
-      <w:r>
-        <w:t xml:space="preserve"> </w:t>
-      </w:r>
-      <w:r>
-        <w:t xml:space="preserve">lo stato</w:t>
-      </w:r>
-      <w:r>
-        <w:t xml:space="preserve"> </w:t>
-      </w:r>
-      <w:r>
-        <w:rPr>
-          <w:rStyle w:val="VerbatimChar"/>
-        </w:rPr>
-        <w:t xml:space="preserve">active</w:t>
-      </w:r>
-      <w:r>
-        <w:t xml:space="preserve"> </w:t>
-      </w:r>
-      <w:r>
-        <w:t xml:space="preserve">e</w:t>
-      </w:r>
-      <w:r>
-        <w:t xml:space="preserve"> </w:t>
-      </w:r>
-      <w:r>
-        <w:rPr>
-          <w:rStyle w:val="VerbatimChar"/>
-        </w:rPr>
-        <w:t xml:space="preserve">permissions</w:t>
-      </w:r>
-      <w:r>
-        <w:t xml:space="preserve"> </w:t>
-      </w:r>
-      <w:r>
-        <w:t xml:space="preserve">dell’utente ad ogni singola richiesta, invece di fidarsi</w:t>
-      </w:r>
-      <w:r>
-        <w:t xml:space="preserve"> </w:t>
-      </w:r>
-      <w:r>
-        <w:t xml:space="preserve">solo del contenuto del JWT. Conseguenza pratica: disattivare un utente o</w:t>
-      </w:r>
-      <w:r>
-        <w:t xml:space="preserve"> </w:t>
-      </w:r>
-      <w:r>
-        <w:t xml:space="preserve">restringergli i permessi ha effetto</w:t>
-      </w:r>
-      <w:r>
-        <w:t xml:space="preserve"> </w:t>
-      </w:r>
+        <w:t xml:space="preserve">Brute-force</w:t>
+      </w:r>
+      <w:r>
+        <w:t xml:space="preserve">:</w:t>
+      </w:r>
+      <w:r>
+        <w:t xml:space="preserve"> </w:t>
+      </w:r>
+      <w:r>
+        <w:rPr>
+          <w:rStyle w:val="VerbatimChar"/>
+        </w:rPr>
+        <w:t xml:space="preserve">POST /api/auth/login</w:t>
+      </w:r>
+      <w:r>
+        <w:t xml:space="preserve"> </w:t>
+      </w:r>
+      <w:r>
+        <w:t xml:space="preserve">Ã¨ protetto da</w:t>
+      </w:r>
+      <w:r>
+        <w:t xml:space="preserve"> </w:t>
+      </w:r>
+      <w:r>
+        <w:rPr>
+          <w:rStyle w:val="VerbatimChar"/>
+        </w:rPr>
+        <w:t xml:space="preserve">express-rate-limit</w:t>
+      </w:r>
+      <w:r>
+        <w:t xml:space="preserve">:</w:t>
+      </w:r>
+      <w:r>
+        <w:t xml:space="preserve"> </w:t>
+      </w:r>
+      <w:r>
+        <w:t xml:space="preserve">massimo 10 tentativi per IP in 15 minuti in produzione. Il limite puÃ² essere</w:t>
+      </w:r>
+      <w:r>
+        <w:t xml:space="preserve"> </w:t>
+      </w:r>
+      <w:r>
+        <w:t xml:space="preserve">sovrascritto con</w:t>
+      </w:r>
+      <w:r>
+        <w:t xml:space="preserve"> </w:t>
+      </w:r>
+      <w:r>
+        <w:rPr>
+          <w:rStyle w:val="VerbatimChar"/>
+        </w:rPr>
+        <w:t xml:space="preserve">LOGIN_RATE_LIMIT_MAX</w:t>
+      </w:r>
+      <w:r>
+        <w:t xml:space="preserve"> </w:t>
+      </w:r>
+      <w:r>
+        <w:t xml:space="preserve">solo per ambienti di test locali.</w:t>
+      </w:r>
+      <w:r>
+        <w:t xml:space="preserve"> </w:t>
+      </w:r>
+      <w:r>
+        <w:t xml:space="preserve">In produzione Express si fida di un solo proxy Azure per determinare l’IP</w:t>
+      </w:r>
+      <w:r>
+        <w:t xml:space="preserve"> </w:t>
+      </w:r>
+      <w:r>
+        <w:t xml:space="preserve">client, evitando di usare lo stesso IP per tutti gli utenti.</w:t>
+      </w:r>
+    </w:p>
+    <w:p>
+      <w:pPr>
+        <w:pStyle w:val="Compact"/>
+        <w:numPr>
+          <w:ilvl w:val="0"/>
+          <w:numId w:val="1009"/>
+        </w:numPr>
+      </w:pPr>
       <w:r>
         <w:rPr>
           <w:b/>
           <w:bCs/>
         </w:rPr>
-        <w:t xml:space="preserve">immediato</w:t>
-      </w:r>
-      <w:r>
-        <w:t xml:space="preserve">, senza dover attendere</w:t>
-      </w:r>
-      <w:r>
-        <w:t xml:space="preserve"> </w:t>
-      </w:r>
-      <w:r>
-        <w:t xml:space="preserve">la scadenza del token (7 giorni) nÃ© implementare una blacklist di token</w:t>
-      </w:r>
-      <w:r>
-        <w:t xml:space="preserve"> </w:t>
-      </w:r>
-      <w:r>
-        <w:t xml:space="preserve">revocati.</w:t>
+        <w:t xml:space="preserve">MFA obbligatoria</w:t>
+      </w:r>
+      <w:r>
+        <w:t xml:space="preserve">: ogni account deve registrare TOTP al primo accesso</w:t>
+      </w:r>
+      <w:r>
+        <w:t xml:space="preserve"> </w:t>
+      </w:r>
+      <w:r>
+        <w:t xml:space="preserve">prima di ricevere una sessione; le challenge di configurazione durano 10</w:t>
+      </w:r>
+      <w:r>
+        <w:t xml:space="preserve"> </w:t>
+      </w:r>
+      <w:r>
+        <w:t xml:space="preserve">minuti e quelle di verifica 5 minuti. Il secret Ã¨ cifrato con AES-256-GCM</w:t>
+      </w:r>
+      <w:r>
+        <w:t xml:space="preserve"> </w:t>
+      </w:r>
+      <w:r>
+        <w:t xml:space="preserve">usando</w:t>
+      </w:r>
+      <w:r>
+        <w:t xml:space="preserve"> </w:t>
+      </w:r>
+      <w:r>
+        <w:rPr>
+          <w:rStyle w:val="VerbatimChar"/>
+        </w:rPr>
+        <w:t xml:space="preserve">MFA_ENCRYPTION_KEY</w:t>
+      </w:r>
+      <w:r>
+        <w:t xml:space="preserve">.</w:t>
+      </w:r>
+    </w:p>
+    <w:p>
+      <w:pPr>
+        <w:pStyle w:val="Compact"/>
+        <w:numPr>
+          <w:ilvl w:val="0"/>
+          <w:numId w:val="1009"/>
+        </w:numPr>
+      </w:pPr>
+      <w:r>
+        <w:rPr>
+          <w:b/>
+          <w:bCs/>
+        </w:rPr>
+        <w:t xml:space="preserve">Verifica continua, non solo al login</w:t>
+      </w:r>
+      <w:r>
+        <w:t xml:space="preserve">:</w:t>
+      </w:r>
+      <w:r>
+        <w:t xml:space="preserve"> </w:t>
+      </w:r>
+      <w:r>
+        <w:rPr>
+          <w:rStyle w:val="VerbatimChar"/>
+        </w:rPr>
+        <w:t xml:space="preserve">attachUser</w:t>
+      </w:r>
+      <w:r>
+        <w:t xml:space="preserve"> </w:t>
+      </w:r>
+      <w:r>
+        <w:t xml:space="preserve">(middleware</w:t>
+      </w:r>
+      <w:r>
+        <w:t xml:space="preserve"> </w:t>
+      </w:r>
+      <w:r>
+        <w:t xml:space="preserve">eseguito su ogni richiesta)</w:t>
+      </w:r>
+      <w:r>
+        <w:t xml:space="preserve"> </w:t>
+      </w:r>
+      <w:r>
+        <w:rPr>
+          <w:b/>
+          <w:bCs/>
+        </w:rPr>
+        <w:t xml:space="preserve">ri-legge da database</w:t>
+      </w:r>
+      <w:r>
+        <w:t xml:space="preserve"> </w:t>
+      </w:r>
+      <w:r>
+        <w:t xml:space="preserve">lo stato</w:t>
+      </w:r>
+      <w:r>
+        <w:t xml:space="preserve"> </w:t>
+      </w:r>
+      <w:r>
+        <w:rPr>
+          <w:rStyle w:val="VerbatimChar"/>
+        </w:rPr>
+        <w:t xml:space="preserve">active</w:t>
+      </w:r>
+      <w:r>
+        <w:t xml:space="preserve">,</w:t>
+      </w:r>
+      <w:r>
+        <w:t xml:space="preserve"> </w:t>
+      </w:r>
+      <w:r>
+        <w:rPr>
+          <w:rStyle w:val="VerbatimChar"/>
+        </w:rPr>
+        <w:t xml:space="preserve">mfaEnabled</w:t>
+      </w:r>
+      <w:r>
+        <w:t xml:space="preserve"> </w:t>
+      </w:r>
+      <w:r>
+        <w:t xml:space="preserve">e</w:t>
+      </w:r>
+      <w:r>
+        <w:t xml:space="preserve"> </w:t>
+      </w:r>
+      <w:r>
+        <w:rPr>
+          <w:rStyle w:val="VerbatimChar"/>
+        </w:rPr>
+        <w:t xml:space="preserve">permissions</w:t>
+      </w:r>
+      <w:r>
+        <w:t xml:space="preserve"> </w:t>
+      </w:r>
+      <w:r>
+        <w:t xml:space="preserve">dell’utente, invece di fidarsi solo del JWT.</w:t>
+      </w:r>
+      <w:r>
+        <w:t xml:space="preserve"> </w:t>
+      </w:r>
+      <w:r>
+        <w:t xml:space="preserve">Disattivare un utente, rimuovergli MFA o restringergli i permessi ha effetto</w:t>
+      </w:r>
+      <w:r>
+        <w:t xml:space="preserve"> </w:t>
+      </w:r>
+      <w:r>
+        <w:t xml:space="preserve">immediato.</w:t>
       </w:r>
     </w:p>
     <w:bookmarkEnd w:id="105"/>
@@ -10111,22 +10251,64 @@
         <w:t xml:space="preserve"> </w:t>
       </w:r>
       <w:r>
-        <w:t xml:space="preserve">â†’ accesso completo (valore di default per ogni utente nuovo o</w:t>
-      </w:r>
-      <w:r>
-        <w:t xml:space="preserve"> </w:t>
-      </w:r>
-      <w:r>
-        <w:t xml:space="preserve">esistente prima dell’introduzione del modello) â€” comportamento</w:t>
-      </w:r>
-      <w:r>
-        <w:t xml:space="preserve"> </w:t>
-      </w:r>
-      <w:r>
-        <w:t xml:space="preserve">“safe by default, restrizione opt-in”</w:t>
-      </w:r>
-      <w:r>
-        <w:t xml:space="preserve">.</w:t>
+        <w:t xml:space="preserve">â†’ accesso completo, riservato agli amministratori. Gli utenti</w:t>
+      </w:r>
+      <w:r>
+        <w:t xml:space="preserve"> </w:t>
+      </w:r>
+      <w:r>
+        <w:t xml:space="preserve">creati dall’app ricevono inizialmente solo</w:t>
+      </w:r>
+      <w:r>
+        <w:t xml:space="preserve"> </w:t>
+      </w:r>
+      <w:r>
+        <w:rPr>
+          <w:rStyle w:val="VerbatimChar"/>
+        </w:rPr>
+        <w:t xml:space="preserve">dashboard</w:t>
+      </w:r>
+      <w:r>
+        <w:t xml:space="preserve">; la promozione ad</w:t>
+      </w:r>
+      <w:r>
+        <w:t xml:space="preserve"> </w:t>
+      </w:r>
+      <w:r>
+        <w:t xml:space="preserve">amministratore Ã¨ rifiutata dal server finchÃ© l’utente non ha MFA attiva.</w:t>
+      </w:r>
+    </w:p>
+    <w:p>
+      <w:pPr>
+        <w:pStyle w:val="Compact"/>
+        <w:numPr>
+          <w:ilvl w:val="0"/>
+          <w:numId w:val="1010"/>
+        </w:numPr>
+      </w:pPr>
+      <w:r>
+        <w:t xml:space="preserve">Gli utenti preesistenti con</w:t>
+      </w:r>
+      <w:r>
+        <w:t xml:space="preserve"> </w:t>
+      </w:r>
+      <w:r>
+        <w:rPr>
+          <w:rStyle w:val="VerbatimChar"/>
+        </w:rPr>
+        <w:t xml:space="preserve">null</w:t>
+      </w:r>
+      <w:r>
+        <w:t xml:space="preserve"> </w:t>
+      </w:r>
+      <w:r>
+        <w:t xml:space="preserve">mantengono i privilegi, ma al prossimo</w:t>
+      </w:r>
+      <w:r>
+        <w:t xml:space="preserve"> </w:t>
+      </w:r>
+      <w:r>
+        <w:t xml:space="preserve">login devono completare l’enrollment MFA prima di ottenere una sessione.</w:t>
       </w:r>
     </w:p>
     <w:p>
@@ -11955,10 +12137,7 @@
               <w:t xml:space="preserve">sslmode=require</w:t>
             </w:r>
             <w:r>
-              <w:t xml:space="preserve"> </w:t>
-            </w:r>
-            <w:r>
-              <w:t xml:space="preserve">verso Azure Postgres</w:t>
+              <w:t xml:space="preserve">; connessioni filtrate dal firewall PostgreSQL</w:t>
             </w:r>
           </w:p>
         </w:tc>
@@ -12005,7 +12184,10 @@
               <w:pStyle w:val="Compact"/>
             </w:pPr>
             <w:r>
-              <w:t xml:space="preserve">Fallback di sviluppo (</w:t>
+              <w:t xml:space="preserve">Obbligatorio in produzione; se assente l’applicazione non si avvia. Il fallback</w:t>
+            </w:r>
+            <w:r>
+              <w:t xml:space="preserve"> </w:t>
             </w:r>
             <w:r>
               <w:rPr>
@@ -12014,23 +12196,104 @@
               <w:t xml:space="preserve">dev-only-secret-change-me</w:t>
             </w:r>
             <w:r>
-              <w:t xml:space="preserve">)</w:t>
-            </w:r>
-            <w:r>
               <w:t xml:space="preserve"> </w:t>
             </w:r>
             <w:r>
+              <w:t xml:space="preserve">Ã¨ consentito solo fuori produzione</w:t>
+            </w:r>
+          </w:p>
+        </w:tc>
+      </w:tr>
+      <w:tr>
+        <w:tc>
+          <w:tcPr/>
+          <w:p>
+            <w:pPr>
+              <w:pStyle w:val="Compact"/>
+            </w:pPr>
+            <w:r>
               <w:rPr>
-                <w:b/>
-                <w:bCs/>
+                <w:rStyle w:val="VerbatimChar"/>
               </w:rPr>
-              <w:t xml:space="preserve">solo</w:t>
+              <w:t xml:space="preserve">MFA_ENCRYPTION_KEY</w:t>
+            </w:r>
+          </w:p>
+        </w:tc>
+        <w:tc>
+          <w:tcPr/>
+          <w:p>
+            <w:pPr>
+              <w:pStyle w:val="Compact"/>
+            </w:pPr>
+            <w:r>
+              <w:rPr>
+                <w:rStyle w:val="VerbatimChar"/>
+              </w:rPr>
+              <w:t xml:space="preserve">.env</w:t>
             </w:r>
             <w:r>
               <w:t xml:space="preserve"> </w:t>
             </w:r>
             <w:r>
-              <w:t xml:space="preserve">se non impostato â€” da non usare mai in produzione</w:t>
+              <w:t xml:space="preserve">locale / variabile d’ambiente Azure App Service</w:t>
+            </w:r>
+          </w:p>
+        </w:tc>
+        <w:tc>
+          <w:tcPr/>
+          <w:p>
+            <w:pPr>
+              <w:pStyle w:val="Compact"/>
+            </w:pPr>
+            <w:r>
+              <w:t xml:space="preserve">Obbligatorio in produzione; protegge i secret TOTP cifrati</w:t>
+            </w:r>
+          </w:p>
+        </w:tc>
+      </w:tr>
+      <w:tr>
+        <w:tc>
+          <w:tcPr/>
+          <w:p>
+            <w:pPr>
+              <w:pStyle w:val="Compact"/>
+            </w:pPr>
+            <w:r>
+              <w:rPr>
+                <w:rStyle w:val="VerbatimChar"/>
+              </w:rPr>
+              <w:t xml:space="preserve">SEED_ADMIN_PASSWORD</w:t>
+            </w:r>
+          </w:p>
+        </w:tc>
+        <w:tc>
+          <w:tcPr/>
+          <w:p>
+            <w:pPr>
+              <w:pStyle w:val="Compact"/>
+            </w:pPr>
+            <w:r>
+              <w:rPr>
+                <w:rStyle w:val="VerbatimChar"/>
+              </w:rPr>
+              <w:t xml:space="preserve">.env</w:t>
+            </w:r>
+            <w:r>
+              <w:t xml:space="preserve"> </w:t>
+            </w:r>
+            <w:r>
+              <w:t xml:space="preserve">locale / variabile d’ambiente Azure App Service</w:t>
+            </w:r>
+          </w:p>
+        </w:tc>
+        <w:tc>
+          <w:tcPr/>
+          <w:p>
+            <w:pPr>
+              <w:pStyle w:val="Compact"/>
+            </w:pPr>
+            <w:r>
+              <w:t xml:space="preserve">Obbligatorio per il seed; non viene mai stampato nei log</w:t>
             </w:r>
           </w:p>
         </w:tc>
@@ -12332,6 +12595,30 @@
               <w:pStyle w:val="Compact"/>
             </w:pPr>
             <w:r>
+              <w:t xml:space="preserve">Intercettazione del traffico / clickjacking / MIME sniffing</w:t>
+            </w:r>
+          </w:p>
+        </w:tc>
+        <w:tc>
+          <w:tcPr/>
+          <w:p>
+            <w:pPr>
+              <w:pStyle w:val="Compact"/>
+            </w:pPr>
+            <w:r>
+              <w:t xml:space="preserve">HTTPS-only, TLS 1.2+, HSTS e header Helmet</w:t>
+            </w:r>
+          </w:p>
+        </w:tc>
+      </w:tr>
+      <w:tr>
+        <w:tc>
+          <w:tcPr/>
+          <w:p>
+            <w:pPr>
+              <w:pStyle w:val="Compact"/>
+            </w:pPr>
+            <w:r>
               <w:t xml:space="preserve">CSRF</w:t>
             </w:r>
           </w:p>
@@ -12380,81 +12667,156 @@
               <w:pStyle w:val="Compact"/>
             </w:pPr>
             <w:r>
-              <w:t xml:space="preserve">SQL injection</w:t>
-            </w:r>
-          </w:p>
-        </w:tc>
-        <w:tc>
-          <w:tcPr/>
-          <w:p>
-            <w:pPr>
-              <w:pStyle w:val="Compact"/>
-            </w:pPr>
-            <w:r>
-              <w:t xml:space="preserve">Tutte le query passano da Drizzle ORM con parametri bindati; nessuna concatenazione di stringhe SQL nei router applicativi</w:t>
-            </w:r>
-          </w:p>
-        </w:tc>
-      </w:tr>
-      <w:tr>
-        <w:tc>
-          <w:tcPr/>
-          <w:p>
-            <w:pPr>
-              <w:pStyle w:val="Compact"/>
-            </w:pPr>
-            <w:r>
-              <w:t xml:space="preserve">Password deboli/compromesse</w:t>
-            </w:r>
-          </w:p>
-        </w:tc>
-        <w:tc>
-          <w:tcPr/>
-          <w:p>
-            <w:pPr>
-              <w:pStyle w:val="Compact"/>
-            </w:pPr>
-            <w:r>
-              <w:t xml:space="preserve">Hashing bcrypt (mai testo in chiaro); nessuna policy di complessitÃ  password lato server oltre alla lunghezza minima (8 caratteri, via zod)</w:t>
-            </w:r>
-          </w:p>
-        </w:tc>
-      </w:tr>
-      <w:tr>
-        <w:tc>
-          <w:tcPr/>
-          <w:p>
-            <w:pPr>
-              <w:pStyle w:val="Compact"/>
-            </w:pPr>
-            <w:r>
-              <w:t xml:space="preserve">Escalation di privilegi tramite l’API permessi</w:t>
-            </w:r>
-          </w:p>
-        </w:tc>
-        <w:tc>
-          <w:tcPr/>
-          <w:p>
-            <w:pPr>
-              <w:pStyle w:val="Compact"/>
-            </w:pPr>
-            <w:r>
-              <w:t xml:space="preserve">Validazione zod con</w:t>
-            </w:r>
-            <w:r>
-              <w:t xml:space="preserve"> </w:t>
-            </w:r>
+              <w:t xml:space="preserve">Brute-force sul login</w:t>
+            </w:r>
+          </w:p>
+        </w:tc>
+        <w:tc>
+          <w:tcPr/>
+          <w:p>
+            <w:pPr>
+              <w:pStyle w:val="Compact"/>
+            </w:pPr>
             <w:r>
               <w:rPr>
                 <w:rStyle w:val="VerbatimChar"/>
               </w:rPr>
-              <w:t xml:space="preserve">z.enum</w:t>
+              <w:t xml:space="preserve">express-rate-limit</w:t>
+            </w:r>
+            <w:r>
+              <w:t xml:space="preserve">: 10 tentativi per IP ogni 15 minuti in produzione</w:t>
+            </w:r>
+          </w:p>
+        </w:tc>
+      </w:tr>
+      <w:tr>
+        <w:tc>
+          <w:tcPr/>
+          <w:p>
+            <w:pPr>
+              <w:pStyle w:val="Compact"/>
+            </w:pPr>
+            <w:r>
+              <w:t xml:space="preserve">Sessioni lasciate aperte</w:t>
+            </w:r>
+          </w:p>
+        </w:tc>
+        <w:tc>
+          <w:tcPr/>
+          <w:p>
+            <w:pPr>
+              <w:pStyle w:val="Compact"/>
+            </w:pPr>
+            <w:r>
+              <w:t xml:space="preserve">JWT 8 ore + logout client dopo 30 minuti di inattivitÃ </w:t>
+            </w:r>
+          </w:p>
+        </w:tc>
+      </w:tr>
+      <w:tr>
+        <w:tc>
+          <w:tcPr/>
+          <w:p>
+            <w:pPr>
+              <w:pStyle w:val="Compact"/>
+            </w:pPr>
+            <w:r>
+              <w:t xml:space="preserve">Compromissione credenziali utente</w:t>
+            </w:r>
+          </w:p>
+        </w:tc>
+        <w:tc>
+          <w:tcPr/>
+          <w:p>
+            <w:pPr>
+              <w:pStyle w:val="Compact"/>
+            </w:pPr>
+            <w:r>
+              <w:t xml:space="preserve">MFA TOTP obbligatoria per ogni account prima del rilascio della sessione</w:t>
+            </w:r>
+          </w:p>
+        </w:tc>
+      </w:tr>
+      <w:tr>
+        <w:tc>
+          <w:tcPr/>
+          <w:p>
+            <w:pPr>
+              <w:pStyle w:val="Compact"/>
+            </w:pPr>
+            <w:r>
+              <w:t xml:space="preserve">SQL injection</w:t>
+            </w:r>
+          </w:p>
+        </w:tc>
+        <w:tc>
+          <w:tcPr/>
+          <w:p>
+            <w:pPr>
+              <w:pStyle w:val="Compact"/>
+            </w:pPr>
+            <w:r>
+              <w:t xml:space="preserve">Tutte le query passano da Drizzle ORM con parametri bindati; nessuna concatenazione di stringhe SQL nei router applicativi</w:t>
+            </w:r>
+          </w:p>
+        </w:tc>
+      </w:tr>
+      <w:tr>
+        <w:tc>
+          <w:tcPr/>
+          <w:p>
+            <w:pPr>
+              <w:pStyle w:val="Compact"/>
+            </w:pPr>
+            <w:r>
+              <w:t xml:space="preserve">Password deboli/compromesse</w:t>
+            </w:r>
+          </w:p>
+        </w:tc>
+        <w:tc>
+          <w:tcPr/>
+          <w:p>
+            <w:pPr>
+              <w:pStyle w:val="Compact"/>
+            </w:pPr>
+            <w:r>
+              <w:t xml:space="preserve">Hashing bcrypt (mai testo in chiaro); minimo 12 caratteri e rifiuto di password comuni</w:t>
+            </w:r>
+          </w:p>
+        </w:tc>
+      </w:tr>
+      <w:tr>
+        <w:tc>
+          <w:tcPr/>
+          <w:p>
+            <w:pPr>
+              <w:pStyle w:val="Compact"/>
+            </w:pPr>
+            <w:r>
+              <w:t xml:space="preserve">Escalation di privilegi tramite l’API permessi</w:t>
+            </w:r>
+          </w:p>
+        </w:tc>
+        <w:tc>
+          <w:tcPr/>
+          <w:p>
+            <w:pPr>
+              <w:pStyle w:val="Compact"/>
+            </w:pPr>
+            <w:r>
+              <w:t xml:space="preserve">Validazione zod; nuovi account limitati a</w:t>
             </w:r>
             <w:r>
               <w:t xml:space="preserve"> </w:t>
             </w:r>
             <w:r>
-              <w:t xml:space="preserve">sulle sole chiavi di permesso valide; guardie anti-self-lockout lato server</w:t>
+              <w:rPr>
+                <w:rStyle w:val="VerbatimChar"/>
+              </w:rPr>
+              <w:t xml:space="preserve">dashboard</w:t>
+            </w:r>
+            <w:r>
+              <w:t xml:space="preserve">; un account senza MFA non puÃ² essere promosso ad admin; guardie anti-self-lockout</w:t>
             </w:r>
           </w:p>
         </w:tc>
@@ -12521,89 +12883,6 @@
       </w:r>
       <w:r>
         <w:t xml:space="preserve">hardening ulteriore:</w:t>
-      </w:r>
-    </w:p>
-    <w:p>
-      <w:pPr>
-        <w:pStyle w:val="Compact"/>
-        <w:numPr>
-          <w:ilvl w:val="0"/>
-          <w:numId w:val="1011"/>
-        </w:numPr>
-      </w:pPr>
-      <w:r>
-        <w:rPr>
-          <w:b/>
-          <w:bCs/>
-        </w:rPr>
-        <w:t xml:space="preserve">Nessun rate-limiting sul login</w:t>
-      </w:r>
-      <w:r>
-        <w:t xml:space="preserve">:</w:t>
-      </w:r>
-      <w:r>
-        <w:t xml:space="preserve"> </w:t>
-      </w:r>
-      <w:r>
-        <w:rPr>
-          <w:rStyle w:val="VerbatimChar"/>
-        </w:rPr>
-        <w:t xml:space="preserve">POST /api/auth/login</w:t>
-      </w:r>
-      <w:r>
-        <w:t xml:space="preserve"> </w:t>
-      </w:r>
-      <w:r>
-        <w:t xml:space="preserve">non ha</w:t>
-      </w:r>
-      <w:r>
-        <w:t xml:space="preserve"> </w:t>
-      </w:r>
-      <w:r>
-        <w:t xml:space="preserve">protezione contro tentativi ripetuti (brute-force). Mitigazione</w:t>
-      </w:r>
-      <w:r>
-        <w:t xml:space="preserve"> </w:t>
-      </w:r>
-      <w:r>
-        <w:t xml:space="preserve">suggerita: rate-limiting per IP/email (es.</w:t>
-      </w:r>
-      <w:r>
-        <w:t xml:space="preserve"> </w:t>
-      </w:r>
-      <w:r>
-        <w:rPr>
-          <w:rStyle w:val="VerbatimChar"/>
-        </w:rPr>
-        <w:t xml:space="preserve">express-rate-limit</w:t>
-      </w:r>
-      <w:r>
-        <w:t xml:space="preserve">) o</w:t>
-      </w:r>
-      <w:r>
-        <w:t xml:space="preserve"> </w:t>
-      </w:r>
-      <w:r>
-        <w:t xml:space="preserve">lockout temporaneo dopo N tentativi falliti.</w:t>
-      </w:r>
-    </w:p>
-    <w:p>
-      <w:pPr>
-        <w:pStyle w:val="Compact"/>
-        <w:numPr>
-          <w:ilvl w:val="0"/>
-          <w:numId w:val="1011"/>
-        </w:numPr>
-      </w:pPr>
-      <w:r>
-        <w:rPr>
-          <w:b/>
-          <w:bCs/>
-        </w:rPr>
-        <w:t xml:space="preserve">Nessuna autenticazione a due fattori (2FA)</w:t>
-      </w:r>
-      <w:r>
-        <w:t xml:space="preserve">.</w:t>
       </w:r>
     </w:p>
     <w:p>
@@ -12824,25 +13103,10 @@
           <w:b/>
           <w:bCs/>
         </w:rPr>
-        <w:t xml:space="preserve">Dipendenza di produzione con vulnerabilitÃ  nota (</w:t>
-      </w:r>
-      <w:r>
-        <w:rPr>
-          <w:rStyle w:val="VerbatimChar"/>
-          <w:b/>
-          <w:bCs/>
-        </w:rPr>
-        <w:t xml:space="preserve">drizzle-orm</w:t>
-      </w:r>
-      <w:r>
-        <w:rPr>
-          <w:b/>
-          <w:bCs/>
-        </w:rPr>
-        <w:t xml:space="preserve">)</w:t>
-      </w:r>
-      <w:r>
-        <w:t xml:space="preserve">:</w:t>
+        <w:t xml:space="preserve">Dipendenze dev vulnerabili</w:t>
+      </w:r>
+      <w:r>
+        <w:t xml:space="preserve">: al 2026-10-05</w:t>
       </w:r>
       <w:r>
         <w:t xml:space="preserve"> </w:t>
@@ -12857,44 +13121,49 @@
         <w:t xml:space="preserve"> </w:t>
       </w:r>
       <w:r>
-        <w:t xml:space="preserve">(verificato il 2026-09-02) segnala una vulnerabilitÃ </w:t>
-      </w:r>
-      <w:r>
-        <w:t xml:space="preserve"> </w:t>
-      </w:r>
-      <w:r>
-        <w:rPr>
-          <w:b/>
-          <w:bCs/>
-        </w:rPr>
-        <w:t xml:space="preserve">high</w:t>
-      </w:r>
-      <w:r>
-        <w:t xml:space="preserve"> </w:t>
-      </w:r>
-      <w:r>
-        <w:t xml:space="preserve">in</w:t>
-      </w:r>
-      <w:r>
-        <w:t xml:space="preserve"> </w:t>
-      </w:r>
-      <w:r>
-        <w:rPr>
-          <w:rStyle w:val="VerbatimChar"/>
-        </w:rPr>
-        <w:t xml:space="preserve">drizzle-orm@0.31.4</w:t>
-      </w:r>
-      <w:r>
-        <w:t xml:space="preserve"> </w:t>
-      </w:r>
-      <w:r>
-        <w:t xml:space="preserve">(SQL injection via identificatori SQL</w:t>
-      </w:r>
-      <w:r>
-        <w:t xml:space="preserve"> </w:t>
-      </w:r>
-      <w:r>
-        <w:t xml:space="preserve">non correttamente escaped,</w:t>
+        <w:t xml:space="preserve">non</w:t>
+      </w:r>
+      <w:r>
+        <w:t xml:space="preserve"> </w:t>
+      </w:r>
+      <w:r>
+        <w:t xml:space="preserve">segnala vulnerabilitÃ  runtime; l’audit completo segnala ancora 10 avvisi</w:t>
+      </w:r>
+      <w:r>
+        <w:t xml:space="preserve"> </w:t>
+      </w:r>
+      <w:r>
+        <w:t xml:space="preserve">(6 high, 4 moderate) nel toolchain di sviluppo. Le correzioni suggerite</w:t>
+      </w:r>
+      <w:r>
+        <w:t xml:space="preserve"> </w:t>
+      </w:r>
+      <w:r>
+        <w:t xml:space="preserve">per Vite e Tailwind richiedono aggiornamenti major e una migrazione/test</w:t>
+      </w:r>
+      <w:r>
+        <w:t xml:space="preserve"> </w:t>
+      </w:r>
+      <w:r>
+        <w:t xml:space="preserve">dedicata. Drizzle ORM Ã¨ stato aggiornato a</w:t>
+      </w:r>
+      <w:r>
+        <w:t xml:space="preserve"> </w:t>
+      </w:r>
+      <w:r>
+        <w:rPr>
+          <w:rStyle w:val="VerbatimChar"/>
+        </w:rPr>
+        <w:t xml:space="preserve">0.45.3</w:t>
+      </w:r>
+      <w:r>
+        <w:t xml:space="preserve">, oltre la versione</w:t>
+      </w:r>
+      <w:r>
+        <w:t xml:space="preserve"> </w:t>
+      </w:r>
+      <w:r>
+        <w:t xml:space="preserve">corretta per</w:t>
       </w:r>
       <w:r>
         <w:t xml:space="preserve"> </w:t>
@@ -12908,88 +13177,133 @@
         </w:r>
       </w:hyperlink>
       <w:r>
-        <w:t xml:space="preserve">),</w:t>
-      </w:r>
-      <w:r>
-        <w:t xml:space="preserve"> </w:t>
-      </w:r>
-      <w:r>
-        <w:t xml:space="preserve">risolta in</w:t>
-      </w:r>
-      <w:r>
-        <w:t xml:space="preserve"> </w:t>
-      </w:r>
-      <w:r>
-        <w:rPr>
-          <w:rStyle w:val="VerbatimChar"/>
-        </w:rPr>
-        <w:t xml:space="preserve">drizzle-orm@0.45.2</w:t>
-      </w:r>
-      <w:r>
-        <w:t xml:space="preserve">. Ãˆ rilevante perchÃ© Drizzle Ã¨ proprio la</w:t>
-      </w:r>
-      <w:r>
-        <w:t xml:space="preserve"> </w:t>
-      </w:r>
-      <w:r>
-        <w:t xml:space="preserve">mitigazione indicata in questa stessa tabella per il rischio SQL injection</w:t>
-      </w:r>
-      <w:r>
-        <w:t xml:space="preserve"> </w:t>
-      </w:r>
-      <w:r>
-        <w:t xml:space="preserve">(Â§5) â€” va rivalutato l’aggiornamento (0.31.x â†’ 0.45.x Ã¨ un salto di major</w:t>
-      </w:r>
-      <w:r>
-        <w:t xml:space="preserve"> </w:t>
-      </w:r>
-      <w:r>
-        <w:t xml:space="preserve">minor con possibili breaking change, non ancora pianificato). Oltre a</w:t>
-      </w:r>
-      <w:r>
-        <w:t xml:space="preserve"> </w:t>
-      </w:r>
-      <w:r>
-        <w:t xml:space="preserve">questa,</w:t>
-      </w:r>
-      <w:r>
-        <w:t xml:space="preserve"> </w:t>
-      </w:r>
-      <w:r>
-        <w:rPr>
-          <w:rStyle w:val="VerbatimChar"/>
-        </w:rPr>
-        <w:t xml:space="preserve">npm audit</w:t>
-      </w:r>
-      <w:r>
-        <w:t xml:space="preserve"> </w:t>
-      </w:r>
-      <w:r>
-        <w:t xml:space="preserve">segnala ulteriori vulnerabilitÃ  moderate/alte ma solo</w:t>
-      </w:r>
-      <w:r>
-        <w:t xml:space="preserve"> </w:t>
-      </w:r>
-      <w:r>
-        <w:t xml:space="preserve">in devDependencies (build/test tooling), non presenti nel bundle servito</w:t>
-      </w:r>
-      <w:r>
-        <w:t xml:space="preserve"> </w:t>
-      </w:r>
-      <w:r>
-        <w:t xml:space="preserve">agli utenti; da rivalutare periodicamente con</w:t>
-      </w:r>
-      <w:r>
-        <w:t xml:space="preserve"> </w:t>
-      </w:r>
-      <w:r>
-        <w:rPr>
-          <w:rStyle w:val="VerbatimChar"/>
-        </w:rPr>
-        <w:t xml:space="preserve">npm audit</w:t>
-      </w:r>
-      <w:r>
         <w:t xml:space="preserve">.</w:t>
+      </w:r>
+    </w:p>
+    <w:p>
+      <w:pPr>
+        <w:pStyle w:val="Compact"/>
+        <w:numPr>
+          <w:ilvl w:val="0"/>
+          <w:numId w:val="1011"/>
+        </w:numPr>
+      </w:pPr>
+      <w:r>
+        <w:rPr>
+          <w:b/>
+          <w:bCs/>
+        </w:rPr>
+        <w:t xml:space="preserve">Firewall PostgreSQL</w:t>
+      </w:r>
+      <w:r>
+        <w:t xml:space="preserve">: l’accesso pubblico resta abilitato e la regola</w:t>
+      </w:r>
+      <w:r>
+        <w:t xml:space="preserve"> </w:t>
+      </w:r>
+      <w:r>
+        <w:t xml:space="preserve">Azure-wide</w:t>
+      </w:r>
+      <w:r>
+        <w:t xml:space="preserve"> </w:t>
+      </w:r>
+      <w:r>
+        <w:rPr>
+          <w:rStyle w:val="VerbatimChar"/>
+        </w:rPr>
+        <w:t xml:space="preserve">0.0.0.0</w:t>
+      </w:r>
+      <w:r>
+        <w:t xml:space="preserve"> </w:t>
+      </w:r>
+      <w:r>
+        <w:t xml:space="preserve">Ã¨ attualmente attiva. Un tentativo di sostituirla con</w:t>
+      </w:r>
+      <w:r>
+        <w:t xml:space="preserve"> </w:t>
+      </w:r>
+      <w:r>
+        <w:t xml:space="preserve">gli IP di uscita dell’App Service ha interrotto la connettivitÃ  applicativa</w:t>
+      </w:r>
+      <w:r>
+        <w:t xml:space="preserve"> </w:t>
+      </w:r>
+      <w:r>
+        <w:t xml:space="preserve">ed Ã¨ stato annullato; non restringere il firewall senza predisporre e</w:t>
+      </w:r>
+      <w:r>
+        <w:t xml:space="preserve"> </w:t>
+      </w:r>
+      <w:r>
+        <w:t xml:space="preserve">verificare prima una rete privata/VNet o gli IP effettivamente usati.</w:t>
+      </w:r>
+      <w:r>
+        <w:t xml:space="preserve"> </w:t>
+      </w:r>
+      <w:r>
+        <w:t xml:space="preserve">Rimane inoltre una regola per un IP di setup da verificare e rimuovere.</w:t>
+      </w:r>
+    </w:p>
+    <w:p>
+      <w:pPr>
+        <w:pStyle w:val="Compact"/>
+        <w:numPr>
+          <w:ilvl w:val="0"/>
+          <w:numId w:val="1011"/>
+        </w:numPr>
+      </w:pPr>
+      <w:r>
+        <w:rPr>
+          <w:b/>
+          <w:bCs/>
+        </w:rPr>
+        <w:t xml:space="preserve">Backup</w:t>
+      </w:r>
+      <w:r>
+        <w:t xml:space="preserve">: retention PostgreSQL di 7 giorni e backup geo-ridondanti</w:t>
+      </w:r>
+      <w:r>
+        <w:t xml:space="preserve"> </w:t>
+      </w:r>
+      <w:r>
+        <w:t xml:space="preserve">disabilitati; verificare esigenze di conservazione e disaster recovery.</w:t>
+      </w:r>
+    </w:p>
+    <w:p>
+      <w:pPr>
+        <w:pStyle w:val="Compact"/>
+        <w:numPr>
+          <w:ilvl w:val="0"/>
+          <w:numId w:val="1011"/>
+        </w:numPr>
+      </w:pPr>
+      <w:r>
+        <w:rPr>
+          <w:b/>
+          <w:bCs/>
+        </w:rPr>
+        <w:t xml:space="preserve">Segreti e monitoraggio</w:t>
+      </w:r>
+      <w:r>
+        <w:t xml:space="preserve">: i segreti Azure sono ancora app settings, non</w:t>
+      </w:r>
+      <w:r>
+        <w:t xml:space="preserve"> </w:t>
+      </w:r>
+      <w:r>
+        <w:t xml:space="preserve">Azure Key Vault; non Ã¨ configurato Application Insights con alerting.</w:t>
+      </w:r>
+      <w:r>
+        <w:t xml:space="preserve"> </w:t>
+      </w:r>
+      <w:r>
+        <w:t xml:space="preserve">Migrare i segreti in Key Vault e attivare monitoraggio dopo aver definito</w:t>
+      </w:r>
+      <w:r>
+        <w:t xml:space="preserve"> </w:t>
+      </w:r>
+      <w:r>
+        <w:t xml:space="preserve">accessi, retention e costi.</w:t>
       </w:r>
     </w:p>
     <w:p>

</xml_diff>

<commit_message>
fix(ci): align npm peer dependency resolution
Use legacy peer dependency resolution consistently so npm ci matches the lockfile while the project remains on Vite 5. This unblocks both GitHub Actions workflows.
</commit_message>
<xml_diff>
--- a/docs/WorkForce-Manager-Documentazione.docx
+++ b/docs/WorkForce-Manager-Documentazione.docx
@@ -6367,6 +6367,85 @@
       </w:r>
       <w:r>
         <w:t xml:space="preserve">deploy)</w:t>
+      </w:r>
+    </w:p>
+    <w:p>
+      <w:pPr>
+        <w:pStyle w:val="Compact"/>
+        <w:numPr>
+          <w:ilvl w:val="0"/>
+          <w:numId w:val="1004"/>
+        </w:numPr>
+      </w:pPr>
+      <w:r>
+        <w:rPr>
+          <w:b/>
+          <w:bCs/>
+        </w:rPr>
+        <w:t xml:space="preserve">npm peer dependencies</w:t>
+      </w:r>
+      <w:r>
+        <w:t xml:space="preserve"> </w:t>
+      </w:r>
+      <w:r>
+        <w:t xml:space="preserve">â€”</w:t>
+      </w:r>
+      <w:r>
+        <w:t xml:space="preserve"> </w:t>
+      </w:r>
+      <w:r>
+        <w:rPr>
+          <w:rStyle w:val="VerbatimChar"/>
+        </w:rPr>
+        <w:t xml:space="preserve">.npmrc</w:t>
+      </w:r>
+      <w:r>
+        <w:t xml:space="preserve"> </w:t>
+      </w:r>
+      <w:r>
+        <w:t xml:space="preserve">abilita</w:t>
+      </w:r>
+      <w:r>
+        <w:t xml:space="preserve"> </w:t>
+      </w:r>
+      <w:r>
+        <w:rPr>
+          <w:rStyle w:val="VerbatimChar"/>
+        </w:rPr>
+        <w:t xml:space="preserve">legacy-peer-deps</w:t>
+      </w:r>
+      <w:r>
+        <w:t xml:space="preserve"> </w:t>
+      </w:r>
+      <w:r>
+        <w:t xml:space="preserve">perchÃ©</w:t>
+      </w:r>
+      <w:r>
+        <w:t xml:space="preserve"> </w:t>
+      </w:r>
+      <w:r>
+        <w:t xml:space="preserve">Vitest 4 supporta Vite 6+ come peer opzionale, mentre il progetto mantiene</w:t>
+      </w:r>
+      <w:r>
+        <w:t xml:space="preserve"> </w:t>
+      </w:r>
+      <w:r>
+        <w:t xml:space="preserve">Vite 5;</w:t>
+      </w:r>
+      <w:r>
+        <w:t xml:space="preserve"> </w:t>
+      </w:r>
+      <w:r>
+        <w:rPr>
+          <w:rStyle w:val="VerbatimChar"/>
+        </w:rPr>
+        <w:t xml:space="preserve">npm ci</w:t>
+      </w:r>
+      <w:r>
+        <w:t xml:space="preserve"> </w:t>
+      </w:r>
+      <w:r>
+        <w:t xml:space="preserve">deve usare la stessa risoluzione del lockfile.</w:t>
       </w:r>
     </w:p>
     <w:p>

</xml_diff>

<commit_message>
test(e2e): isolate auth rate limit
Run the built app in test mode with an explicit static-serving flag so E2E authentication uses the test rate limit while production keeps its stricter policy.
</commit_message>
<xml_diff>
--- a/docs/WorkForce-Manager-Documentazione.docx
+++ b/docs/WorkForce-Manager-Documentazione.docx
@@ -23,7 +23,7 @@
         <w:pStyle w:val="Date"/>
       </w:pPr>
       <w:r>
-        <w:t xml:space="preserve">2026-10-05</w:t>
+        <w:t xml:space="preserve">2026-10-06</w:t>
       </w:r>
     </w:p>
     <w:sdt>
@@ -6367,6 +6367,61 @@
       </w:r>
       <w:r>
         <w:t xml:space="preserve">deploy)</w:t>
+      </w:r>
+    </w:p>
+    <w:p>
+      <w:pPr>
+        <w:pStyle w:val="Compact"/>
+        <w:numPr>
+          <w:ilvl w:val="0"/>
+          <w:numId w:val="1004"/>
+        </w:numPr>
+      </w:pPr>
+      <w:r>
+        <w:rPr>
+          <w:b/>
+          <w:bCs/>
+        </w:rPr>
+        <w:t xml:space="preserve">E2E</w:t>
+      </w:r>
+      <w:r>
+        <w:t xml:space="preserve"> </w:t>
+      </w:r>
+      <w:r>
+        <w:t xml:space="preserve">â€” Playwright avvia il bundle statico in</w:t>
+      </w:r>
+      <w:r>
+        <w:t xml:space="preserve"> </w:t>
+      </w:r>
+      <w:r>
+        <w:rPr>
+          <w:rStyle w:val="VerbatimChar"/>
+        </w:rPr>
+        <w:t xml:space="preserve">NODE_ENV=test</w:t>
+      </w:r>
+      <w:r>
+        <w:t xml:space="preserve"> </w:t>
+      </w:r>
+      <w:r>
+        <w:t xml:space="preserve">con</w:t>
+      </w:r>
+      <w:r>
+        <w:t xml:space="preserve"> </w:t>
+      </w:r>
+      <w:r>
+        <w:rPr>
+          <w:rStyle w:val="VerbatimChar"/>
+        </w:rPr>
+        <w:t xml:space="preserve">TEST_SERVE_STATIC=true</w:t>
+      </w:r>
+      <w:r>
+        <w:t xml:space="preserve">, mantenendo il limite login di test e senza</w:t>
+      </w:r>
+      <w:r>
+        <w:t xml:space="preserve"> </w:t>
+      </w:r>
+      <w:r>
+        <w:t xml:space="preserve">disattivare il rate limit production.</w:t>
       </w:r>
     </w:p>
     <w:p>

</xml_diff>